<commit_message>
subiendo todos los cambios y añadiendo ML
</commit_message>
<xml_diff>
--- a/docs/ClimePeru_Unidad2_Documentacion_Completa.docx
+++ b/docs/ClimePeru_Unidad2_Documentacion_Completa.docx
@@ -20513,7 +20513,7 @@
           <w:sz w:val="22"/>
           <w:szCs w:val="22"/>
         </w:rPr>
-        <w:t xml:space="preserve">Pipeline streaming funcional basado en Kafka + Spark Structured Streaming con 14 servicios contenedorizados multi-estación.</w:t>
+        <w:t xml:space="preserve">Pipeline streaming funcional basado en Kafka + Spark Structured Streaming con 15 servicios contenedorizados multi-estación.</w:t>
       </w:r>
     </w:p>
     <w:p>
@@ -20603,7 +20603,7 @@
           <w:sz w:val="22"/>
           <w:szCs w:val="22"/>
         </w:rPr>
-        <w:t xml:space="preserve">Dashboard interactivo (Streamlit) con filtro por estación, streaming desde Kafka vía consumer group dashboard-consumer con lag cero.</w:t>
+        <w:t xml:space="preserve">Dashboard interactivo (Streamlit) con 3 pestañas: Histórico, Tiempo Real (Kafka) y Predicciones ML (XGBoost).</w:t>
       </w:r>
     </w:p>
     <w:p>
@@ -20621,7 +20621,7 @@
           <w:sz w:val="22"/>
           <w:szCs w:val="22"/>
         </w:rPr>
-        <w:t xml:space="preserve">Kafka Value Exporter personalizado que expone variables reales de sensores (temperatura, humedad, IAQ, eCO₂, VOC, anomalías) como métricas Prometheus gauge con labels de ubicación (department/province/district).</w:t>
+        <w:t xml:space="preserve">Kafka Value Exporter personalizado que expone variables reales de sensores como métricas Prometheus gauge.</w:t>
       </w:r>
     </w:p>
     <w:p>
@@ -20639,7 +20639,7 @@
           <w:sz w:val="22"/>
           <w:szCs w:val="22"/>
         </w:rPr>
-        <w:t xml:space="preserve">Dashboard Grafana Sensores — Variables por Estación con 10 paneles: resumen de llegada, temperatura, humedad, presión, calidad del aire, anomalías, alertas activas y estado de sensores. Incluye anotaciones de alertas en gráficos de anomalías.</w:t>
+        <w:t xml:space="preserve">Dashboard Grafana Sensores con 10 paneles + alertas Prometheus.</w:t>
       </w:r>
     </w:p>
     <w:p>
@@ -20657,7 +20657,7 @@
           <w:sz w:val="22"/>
           <w:szCs w:val="22"/>
         </w:rPr>
-        <w:t xml:space="preserve">10 reglas de alerta Prometheus (4 de infraestructura Kafka + 6 de sensores) que detectan anomalías de temperatura, IAQ crítico, datos desactualizados, bridges caídos y z-scores elevados.</w:t>
+        <w:t xml:space="preserve">10 reglas de alerta Prometheus (4 de infraestructura Kafka + 6 de sensores).</w:t>
       </w:r>
     </w:p>
     <w:p>
@@ -20675,7 +20675,7 @@
           <w:sz w:val="22"/>
           <w:szCs w:val="22"/>
         </w:rPr>
-        <w:t xml:space="preserve">Observabilidad completa: Prometheus, Grafana con 2 dashboards (Kafka Overview + Sensor Variables), Kafka UI, métricas de offset, lag y variables de sensor.</w:t>
+        <w:t xml:space="preserve">Pipeline ML completo: 2 tipos de modelos (largo y corto plazo), 7 modelos entrenados (4 largo + 3 corto), feature engineering automatizado, predicción interactiva desde dashboard.</w:t>
       </w:r>
     </w:p>
     <w:p>
@@ -20693,23 +20693,7 @@
           <w:sz w:val="22"/>
           <w:szCs w:val="22"/>
         </w:rPr>
-        <w:t xml:space="preserve">Documentación operativa con estimación de costos, estrategia de escalado y comandos de limpieza completa.</w:t>
-      </w:r>
-    </w:p>
-    <w:p>
-      <w:pPr>
-        <w:pStyle w:val="Heading2"/>
-        <w:spacing w:before="300" w:after="160"/>
-      </w:pPr>
-      <w:r>
-        <w:rPr>
-          <w:b/>
-          <w:bCs/>
-          <w:color w:val="2E75B6"/>
-          <w:sz w:val="28"/>
-          <w:szCs w:val="28"/>
-        </w:rPr>
-        <w:t xml:space="preserve">9.2 Limitaciones Encontradas</w:t>
+        <w:t xml:space="preserve">Modelos largo plazo con R² &gt; 0.99 y MAE &lt; 0.11°C usando datos SENAMHI de 50+ años.</w:t>
       </w:r>
     </w:p>
     <w:p>
@@ -20727,7 +20711,7 @@
           <w:sz w:val="22"/>
           <w:szCs w:val="22"/>
         </w:rPr>
-        <w:t xml:space="preserve">3 instancias Spark en modo local[*] — sin distribución ni tolerancia a fallos del procesador.</w:t>
+        <w:t xml:space="preserve">Modelos corto plazo con R² &gt; 0.99 y MAE &lt; 0.05°C para sensores con datos de calidad.</w:t>
       </w:r>
     </w:p>
     <w:p>
@@ -20745,7 +20729,7 @@
           <w:sz w:val="22"/>
           <w:szCs w:val="22"/>
         </w:rPr>
-        <w:t xml:space="preserve">Kafka con 1 broker y 1 partición por tópico — sin alta disponibilidad ni paralelismo.</w:t>
+        <w:t xml:space="preserve">Observabilidad completa: Prometheus, Grafana con 2 dashboards, Kafka UI, métricas de offset, lag y variables de sensor.</w:t>
       </w:r>
     </w:p>
     <w:p>
@@ -20763,7 +20747,23 @@
           <w:sz w:val="22"/>
           <w:szCs w:val="22"/>
         </w:rPr>
-        <w:t xml:space="preserve">Los datos históricos usan tmax (temperatura máxima) como proxy de temperatura ambiente — los sensores no reportan temperatura instantánea.</w:t>
+        <w:t xml:space="preserve">Documentación operativa con estimación de costos, estrategia de escalado y ML pipeline.</w:t>
+      </w:r>
+    </w:p>
+    <w:p>
+      <w:pPr>
+        <w:pStyle w:val="Heading2"/>
+        <w:spacing w:before="300" w:after="160"/>
+      </w:pPr>
+      <w:r>
+        <w:rPr>
+          <w:b/>
+          <w:bCs/>
+          <w:color w:val="2E75B6"/>
+          <w:sz w:val="28"/>
+          <w:szCs w:val="28"/>
+        </w:rPr>
+        <w:t xml:space="preserve">9.2 Limitaciones Encontradas</w:t>
       </w:r>
     </w:p>
     <w:p>
@@ -20781,7 +20781,7 @@
           <w:sz w:val="22"/>
           <w:szCs w:val="22"/>
         </w:rPr>
-        <w:t xml:space="preserve">No hay métricas de bridges/sparks expuestas directamente a Prometheus (solo logs); las métricas de sensores se obtienen vía el Value Exporter que lee desde Kafka.</w:t>
+        <w:t xml:space="preserve">3 instancias Spark en modo local[*] — sin distribución ni tolerancia a fallos del procesador.</w:t>
       </w:r>
     </w:p>
     <w:p>
@@ -20799,7 +20799,7 @@
           <w:sz w:val="22"/>
           <w:szCs w:val="22"/>
         </w:rPr>
-        <w:t xml:space="preserve">Sin sistema de notificaciones automáticas (email/WhatsApp) para alertas de anomalías — las alertas solo se visualizan en Prometheus y Grafana.</w:t>
+        <w:t xml:space="preserve">Kafka con 1 broker y 1 partición por tópico — sin alta disponibilidad ni paralelismo.</w:t>
       </w:r>
     </w:p>
     <w:p>
@@ -20817,23 +20817,7 @@
           <w:sz w:val="22"/>
           <w:szCs w:val="22"/>
         </w:rPr>
-        <w:t xml:space="preserve">Sin autenticación ni control de acceso al dashboard o Kafka UI.</w:t>
-      </w:r>
-    </w:p>
-    <w:p>
-      <w:pPr>
-        <w:pStyle w:val="Heading2"/>
-        <w:spacing w:before="300" w:after="160"/>
-      </w:pPr>
-      <w:r>
-        <w:rPr>
-          <w:b/>
-          <w:bCs/>
-          <w:color w:val="2E75B6"/>
-          <w:sz w:val="28"/>
-          <w:szCs w:val="28"/>
-        </w:rPr>
-        <w:t xml:space="preserve">9.3 Mejoras Propuestas</w:t>
+        <w:t xml:space="preserve">Los datos históricos usan tmax (temperatura máxima) como proxy de temperatura ambiente.</w:t>
       </w:r>
     </w:p>
     <w:p>
@@ -20851,7 +20835,7 @@
           <w:sz w:val="22"/>
           <w:szCs w:val="22"/>
         </w:rPr>
-        <w:t xml:space="preserve">Exponer métricas de bridges (registros/s, checkpoint lag, errores) y sparks (batch progress, latency) a Prometheus.</w:t>
+        <w:t xml:space="preserve">No hay métricas de bridges/sparks expuestas directamente a Prometheus (solo logs).</w:t>
       </w:r>
     </w:p>
     <w:p>
@@ -20869,7 +20853,7 @@
           <w:sz w:val="22"/>
           <w:szCs w:val="22"/>
         </w:rPr>
-        <w:t xml:space="preserve">Migrar Spark a modo cluster (Standalone o YARN) con 2+ workers para escalado horizontal.</w:t>
+        <w:t xml:space="preserve">Sin sistema de notificaciones automáticas (email/WhatsApp) para alertas.</w:t>
       </w:r>
     </w:p>
     <w:p>
@@ -20887,7 +20871,7 @@
           <w:sz w:val="22"/>
           <w:szCs w:val="22"/>
         </w:rPr>
-        <w:t xml:space="preserve">Aumentar a 3 brokers Kafka con replicación factor 2 para alta disponibilidad.</w:t>
+        <w:t xml:space="preserve">Sin autenticación ni control de acceso al dashboard o Kafka UI.</w:t>
       </w:r>
     </w:p>
     <w:p>
@@ -20905,7 +20889,23 @@
           <w:sz w:val="22"/>
           <w:szCs w:val="22"/>
         </w:rPr>
-        <w:t xml:space="preserve">Implementar rolling upgrade y zero-downtime deployment para los servicios.</w:t>
+        <w:t xml:space="preserve">Sensor grupo_3 (PUNO) presenta datos defectuosos (presión 186 hPa vs 646 esperado, temperatura constante ~-0.06°C) que impiden entrenar modelo corto plazo confiable.</w:t>
+      </w:r>
+    </w:p>
+    <w:p>
+      <w:pPr>
+        <w:pStyle w:val="Heading2"/>
+        <w:spacing w:before="300" w:after="160"/>
+      </w:pPr>
+      <w:r>
+        <w:rPr>
+          <w:b/>
+          <w:bCs/>
+          <w:color w:val="2E75B6"/>
+          <w:sz w:val="28"/>
+          <w:szCs w:val="28"/>
+        </w:rPr>
+        <w:t xml:space="preserve">9.3 Mejoras Propuestas</w:t>
       </w:r>
     </w:p>
     <w:p>
@@ -20923,7 +20923,7 @@
           <w:sz w:val="22"/>
           <w:szCs w:val="22"/>
         </w:rPr>
-        <w:t xml:space="preserve">Configurar Alertmanager de Prometheus con notificaciones por email/WhatsApp/Slack para alertas de anomalías y caídas de servicios.</w:t>
+        <w:t xml:space="preserve">Exponer métricas de bridges y sparks a Prometheus.</w:t>
       </w:r>
     </w:p>
     <w:p>
@@ -20941,7 +20941,7 @@
           <w:sz w:val="22"/>
           <w:szCs w:val="22"/>
         </w:rPr>
-        <w:t xml:space="preserve">Agregar autenticación básica en dashboards Streamlit y Kafka UI.</w:t>
+        <w:t xml:space="preserve">Migrar Spark a modo cluster (Standalone o YARN) con 2+ workers.</w:t>
       </w:r>
     </w:p>
     <w:p>
@@ -20959,41 +20959,7 @@
           <w:sz w:val="22"/>
           <w:szCs w:val="22"/>
         </w:rPr>
-        <w:t xml:space="preserve">Incorporar pruebas de carga con generador sintético de datos para validar throughput máximo.</w:t>
-      </w:r>
-    </w:p>
-    <w:p>
-      <w:pPr>
-        <w:pStyle w:val="Heading2"/>
-        <w:spacing w:before="300" w:after="160"/>
-      </w:pPr>
-      <w:r>
-        <w:rPr>
-          <w:b/>
-          <w:bCs/>
-          <w:color w:val="2E75B6"/>
-          <w:sz w:val="28"/>
-          <w:szCs w:val="28"/>
-        </w:rPr>
-        <w:t xml:space="preserve">9.4 Preparación para ML Distribuido</w:t>
-      </w:r>
-    </w:p>
-    <w:p>
-      <w:pPr>
-        <w:spacing w:after="120" w:line="276"/>
-        <w:jc w:val="both"/>
-      </w:pPr>
-      <w:r>
-        <w:rPr>
-          <w:b w:val="false"/>
-          <w:bCs w:val="false"/>
-          <w:i w:val="false"/>
-          <w:iCs w:val="false"/>
-          <w:color w:val="1E293B"/>
-          <w:sz w:val="22"/>
-          <w:szCs w:val="22"/>
-        </w:rPr>
-        <w:t xml:space="preserve">El pipeline actual está diseñado para integrarse con modelos de Machine Learning distribuido en las siguientes etapas:</w:t>
+        <w:t xml:space="preserve">Aumentar a 3 brokers Kafka con replicación factor 2.</w:t>
       </w:r>
     </w:p>
     <w:p>
@@ -21011,7 +20977,7 @@
           <w:sz w:val="22"/>
           <w:szCs w:val="22"/>
         </w:rPr>
-        <w:t xml:space="preserve">Fase 1 (actual): Detección de anomalías basada en estadística descriptiva (promedio + desviación estándar).</w:t>
+        <w:t xml:space="preserve">Implementar rolling upgrade y zero-downtime deployment.</w:t>
       </w:r>
     </w:p>
     <w:p>
@@ -21029,7 +20995,7 @@
           <w:sz w:val="22"/>
           <w:szCs w:val="22"/>
         </w:rPr>
-        <w:t xml:space="preserve">Fase 2: Incorporar modelos de forecasting (ARIMA, Prophet) para predicción de temperaturas.</w:t>
+        <w:t xml:space="preserve">Configurar Alertmanager con notificaciones por email/WhatsApp/Slack.</w:t>
       </w:r>
     </w:p>
     <w:p>
@@ -21047,7 +21013,7 @@
           <w:sz w:val="22"/>
           <w:szCs w:val="22"/>
         </w:rPr>
-        <w:t xml:space="preserve">Fase 3: Modelos clasificadores en Spark MLlib para categorización de patrones climáticos.</w:t>
+        <w:t xml:space="preserve">Agregar autenticación básica en dashboards.</w:t>
       </w:r>
     </w:p>
     <w:p>
@@ -21065,7 +21031,7 @@
           <w:sz w:val="22"/>
           <w:szCs w:val="22"/>
         </w:rPr>
-        <w:t xml:space="preserve">Fase 4: Deep Learning con TensorFlow/PyTorch distribuido para predicción multi-variable.</w:t>
+        <w:t xml:space="preserve">Incorporar re-entrenamiento automático de modelos ML programado (cron) o manual desde dashboard.</w:t>
       </w:r>
     </w:p>
     <w:p>
@@ -21083,7 +21049,131 @@
           <w:sz w:val="22"/>
           <w:szCs w:val="22"/>
         </w:rPr>
-        <w:t xml:space="preserve">Infraestructura: Los datos en Parquet y el stream en Kafka son directamente consumibles por Spark ML pipelines.</w:t>
+        <w:t xml:space="preserve">Agregar más estaciones SENAMHI para mejorar cobertura geográfica de modelos largo plazo.</w:t>
+      </w:r>
+    </w:p>
+    <w:p>
+      <w:pPr>
+        <w:pStyle w:val="ListParagraph"/>
+        <w:numPr>
+          <w:ilvl w:val="0"/>
+          <w:numId w:val="2"/>
+        </w:numPr>
+        <w:spacing w:after="60"/>
+      </w:pPr>
+      <w:r>
+        <w:rPr>
+          <w:color w:val="1E293B"/>
+          <w:sz w:val="22"/>
+          <w:szCs w:val="22"/>
+        </w:rPr>
+        <w:t xml:space="preserve">Implementar ensemble de modelos (XGBoost + LSTM) para predicción multi-variable.</w:t>
+      </w:r>
+    </w:p>
+    <w:p>
+      <w:pPr>
+        <w:pStyle w:val="Heading2"/>
+        <w:spacing w:before="300" w:after="160"/>
+      </w:pPr>
+      <w:r>
+        <w:rPr>
+          <w:b/>
+          <w:bCs/>
+          <w:color w:val="2E75B6"/>
+          <w:sz w:val="28"/>
+          <w:szCs w:val="28"/>
+        </w:rPr>
+        <w:t xml:space="preserve">9.4 Preparación para ML Distribuido</w:t>
+      </w:r>
+    </w:p>
+    <w:p>
+      <w:pPr>
+        <w:spacing w:after="120" w:line="276"/>
+        <w:jc w:val="both"/>
+      </w:pPr>
+      <w:r>
+        <w:rPr>
+          <w:b w:val="false"/>
+          <w:bCs w:val="false"/>
+          <w:i w:val="false"/>
+          <w:iCs w:val="false"/>
+          <w:color w:val="1E293B"/>
+          <w:sz w:val="22"/>
+          <w:szCs w:val="22"/>
+        </w:rPr>
+        <w:t xml:space="preserve">El pipeline actual implementa ML con XGBoost en dos modalidades:</w:t>
+      </w:r>
+    </w:p>
+    <w:p>
+      <w:pPr>
+        <w:pStyle w:val="ListParagraph"/>
+        <w:numPr>
+          <w:ilvl w:val="0"/>
+          <w:numId w:val="2"/>
+        </w:numPr>
+        <w:spacing w:after="60"/>
+      </w:pPr>
+      <w:r>
+        <w:rPr>
+          <w:color w:val="1E293B"/>
+          <w:sz w:val="22"/>
+          <w:szCs w:val="22"/>
+        </w:rPr>
+        <w:t xml:space="preserve">Largo plazo: Predicción de tmax diaria usando datos SENAMHI históricos (50+ años, 60 estaciones), con features de lags, rolling means y codificación temporal.</w:t>
+      </w:r>
+    </w:p>
+    <w:p>
+      <w:pPr>
+        <w:pStyle w:val="ListParagraph"/>
+        <w:numPr>
+          <w:ilvl w:val="0"/>
+          <w:numId w:val="2"/>
+        </w:numPr>
+        <w:spacing w:after="60"/>
+      </w:pPr>
+      <w:r>
+        <w:rPr>
+          <w:color w:val="1E293B"/>
+          <w:sz w:val="22"/>
+          <w:szCs w:val="22"/>
+        </w:rPr>
+        <w:t xml:space="preserve">Corto plazo: Predicción de temperatura a 5-15 minutos usando datos streaming de sensores IoT, con features de ratio presión/temperatura y ventanas móviles.</w:t>
+      </w:r>
+    </w:p>
+    <w:p>
+      <w:pPr>
+        <w:pStyle w:val="ListParagraph"/>
+        <w:numPr>
+          <w:ilvl w:val="0"/>
+          <w:numId w:val="2"/>
+        </w:numPr>
+        <w:spacing w:after="60"/>
+      </w:pPr>
+      <w:r>
+        <w:rPr>
+          <w:color w:val="1E293B"/>
+          <w:sz w:val="22"/>
+          <w:szCs w:val="22"/>
+        </w:rPr>
+        <w:t xml:space="preserve">Infraestructura: Los datos en Parquet son consumidos directamente por sklearn/xgboost. Modelos persistidos en formato joblib.</w:t>
+      </w:r>
+    </w:p>
+    <w:p>
+      <w:pPr>
+        <w:pStyle w:val="ListParagraph"/>
+        <w:numPr>
+          <w:ilvl w:val="0"/>
+          <w:numId w:val="2"/>
+        </w:numPr>
+        <w:spacing w:after="60"/>
+      </w:pPr>
+      <w:r>
+        <w:rPr>
+          <w:color w:val="1E293B"/>
+          <w:sz w:val="22"/>
+          <w:szCs w:val="22"/>
+        </w:rPr>
+        <w:t xml:space="preserve">Escalabilidad: El feature engineering y entrenamiento pueden migrarse a Spark MLlib para manejar miles de estaciones.</w:t>
       </w:r>
     </w:p>
     <w:p>
@@ -24242,6 +24332,2850 @@
         </w:tc>
       </w:tr>
     </w:tbl>
+    <w:p>
+      <w:pPr>
+        <w:pStyle w:val="Heading1"/>
+        <w:spacing w:before="400" w:after="200"/>
+      </w:pPr>
+      <w:r>
+        <w:rPr>
+          <w:b/>
+          <w:bCs/>
+          <w:color w:val="1B3A6B"/>
+          <w:sz w:val="36"/>
+          <w:szCs w:val="36"/>
+        </w:rPr>
+        <w:t xml:space="preserve">11. PIPELINE DE MACHINE LEARNING</w:t>
+      </w:r>
+    </w:p>
+    <w:p>
+      <w:pPr>
+        <w:pBdr>
+          <w:bottom w:val="single" w:color="2E75B6" w:sz="6" w:space="1"/>
+        </w:pBdr>
+        <w:spacing w:after="200"/>
+      </w:pPr>
+    </w:p>
+    <w:p>
+      <w:pPr>
+        <w:pStyle w:val="Heading2"/>
+        <w:spacing w:before="300" w:after="160"/>
+      </w:pPr>
+      <w:r>
+        <w:rPr>
+          <w:b/>
+          <w:bCs/>
+          <w:color w:val="2E75B6"/>
+          <w:sz w:val="28"/>
+          <w:szCs w:val="28"/>
+        </w:rPr>
+        <w:t xml:space="preserve">11.1 Descripción General</w:t>
+      </w:r>
+    </w:p>
+    <w:p>
+      <w:pPr>
+        <w:spacing w:after="120" w:line="276"/>
+        <w:jc w:val="both"/>
+      </w:pPr>
+      <w:r>
+        <w:rPr>
+          <w:b w:val="false"/>
+          <w:bCs w:val="false"/>
+          <w:i w:val="false"/>
+          <w:iCs w:val="false"/>
+          <w:color w:val="1E293B"/>
+          <w:sz w:val="22"/>
+          <w:szCs w:val="22"/>
+        </w:rPr>
+        <w:t xml:space="preserve">El pipeline de Machine Learning del proyecto CliMePerú proporciona predicciones de temperatura en dos horizontes temporales distintos: largo plazo (predicción diaria de tmax usando datos históricos SENAMHI) y corto plazo (predicción de temperatura a intervalos de 5-15 minutos usando datos streaming de sensores IoT). Ambos modelos se integran en el dashboard de Streamlit como la tercera pestaña 'Predicciones ML'.</w:t>
+      </w:r>
+    </w:p>
+    <w:p>
+      <w:pPr>
+        <w:pStyle w:val="Heading2"/>
+        <w:spacing w:before="300" w:after="160"/>
+      </w:pPr>
+      <w:r>
+        <w:rPr>
+          <w:b/>
+          <w:bCs/>
+          <w:color w:val="2E75B6"/>
+          <w:sz w:val="28"/>
+          <w:szCs w:val="28"/>
+        </w:rPr>
+        <w:t xml:space="preserve">11.2 Arquitectura ML</w:t>
+      </w:r>
+    </w:p>
+    <w:p>
+      <w:pPr>
+        <w:spacing w:after="120" w:line="276"/>
+        <w:jc w:val="both"/>
+      </w:pPr>
+      <w:r>
+        <w:rPr>
+          <w:b w:val="false"/>
+          <w:bCs w:val="false"/>
+          <w:i w:val="false"/>
+          <w:iCs w:val="false"/>
+          <w:color w:val="1E293B"/>
+          <w:sz w:val="22"/>
+          <w:szCs w:val="22"/>
+        </w:rPr>
+        <w:t xml:space="preserve">La arquitectura ML consta de los siguientes componentes:</w:t>
+      </w:r>
+    </w:p>
+    <w:p>
+      <w:pPr>
+        <w:pStyle w:val="ListParagraph"/>
+        <w:numPr>
+          <w:ilvl w:val="0"/>
+          <w:numId w:val="2"/>
+        </w:numPr>
+        <w:spacing w:after="60"/>
+      </w:pPr>
+      <w:r>
+        <w:rPr>
+          <w:color w:val="1E293B"/>
+          <w:sz w:val="22"/>
+          <w:szCs w:val="22"/>
+        </w:rPr>
+        <w:t xml:space="preserve">Módulo de features (ml/features.py): Ingeniería de características para ambos horizontes.</w:t>
+      </w:r>
+    </w:p>
+    <w:p>
+      <w:pPr>
+        <w:pStyle w:val="ListParagraph"/>
+        <w:numPr>
+          <w:ilvl w:val="0"/>
+          <w:numId w:val="2"/>
+        </w:numPr>
+        <w:spacing w:after="60"/>
+      </w:pPr>
+      <w:r>
+        <w:rPr>
+          <w:color w:val="1E293B"/>
+          <w:sz w:val="22"/>
+          <w:szCs w:val="22"/>
+        </w:rPr>
+        <w:t xml:space="preserve">Módulo de entrenamiento largo plazo (ml/train_largo_plazo.py): Entrena modelos XGBoost con datos históricos.</w:t>
+      </w:r>
+    </w:p>
+    <w:p>
+      <w:pPr>
+        <w:pStyle w:val="ListParagraph"/>
+        <w:numPr>
+          <w:ilvl w:val="0"/>
+          <w:numId w:val="2"/>
+        </w:numPr>
+        <w:spacing w:after="60"/>
+      </w:pPr>
+      <w:r>
+        <w:rPr>
+          <w:color w:val="1E293B"/>
+          <w:sz w:val="22"/>
+          <w:szCs w:val="22"/>
+        </w:rPr>
+        <w:t xml:space="preserve">Módulo de entrenamiento corto plazo (ml/train_corto_plazo.py): Entrena modelos XGBoost con datos streaming.</w:t>
+      </w:r>
+    </w:p>
+    <w:p>
+      <w:pPr>
+        <w:pStyle w:val="ListParagraph"/>
+        <w:numPr>
+          <w:ilvl w:val="0"/>
+          <w:numId w:val="2"/>
+        </w:numPr>
+        <w:spacing w:after="60"/>
+      </w:pPr>
+      <w:r>
+        <w:rPr>
+          <w:color w:val="1E293B"/>
+          <w:sz w:val="22"/>
+          <w:szCs w:val="22"/>
+        </w:rPr>
+        <w:t xml:space="preserve">Módulo de predicción (ml/predict.py): Funciones de inferencia para ambos horizontes, con caché en sesión.</w:t>
+      </w:r>
+    </w:p>
+    <w:p>
+      <w:pPr>
+        <w:pStyle w:val="ListParagraph"/>
+        <w:numPr>
+          <w:ilvl w:val="0"/>
+          <w:numId w:val="2"/>
+        </w:numPr>
+        <w:spacing w:after="60"/>
+      </w:pPr>
+      <w:r>
+        <w:rPr>
+          <w:color w:val="1E293B"/>
+          <w:sz w:val="22"/>
+          <w:szCs w:val="22"/>
+        </w:rPr>
+        <w:t xml:space="preserve">Modelos persistidos (ml/models/): Archivos .pkl y métricas JSON por estación.</w:t>
+      </w:r>
+    </w:p>
+    <w:p>
+      <w:pPr>
+        <w:pStyle w:val="ListParagraph"/>
+        <w:numPr>
+          <w:ilvl w:val="0"/>
+          <w:numId w:val="2"/>
+        </w:numPr>
+        <w:spacing w:after="60"/>
+      </w:pPr>
+      <w:r>
+        <w:rPr>
+          <w:color w:val="1E293B"/>
+          <w:sz w:val="22"/>
+          <w:szCs w:val="22"/>
+        </w:rPr>
+        <w:t xml:space="preserve">Dashboard (dashboard/app.py): Tercer tab con interfaz interactiva de predicción.</w:t>
+      </w:r>
+    </w:p>
+    <w:p>
+      <w:pPr>
+        <w:spacing w:after="120" w:line="276"/>
+        <w:jc w:val="both"/>
+      </w:pPr>
+      <w:r>
+        <w:rPr>
+          <w:b w:val="false"/>
+          <w:bCs w:val="false"/>
+          <w:i w:val="false"/>
+          <w:iCs w:val="false"/>
+          <w:color w:val="1E293B"/>
+          <w:sz w:val="22"/>
+          <w:szCs w:val="22"/>
+        </w:rPr>
+        <w:t xml:space="preserve">Los datos fluyen desde los Parquets históricos y streaming hacia los pipelines de entrenamiento. Los modelos entrenados se guardan en el directorio ml/models/ que está montado como volumen Docker para persistencia entre recreaciones del contenedor.</w:t>
+      </w:r>
+    </w:p>
+    <w:p>
+      <w:pPr>
+        <w:pStyle w:val="Heading2"/>
+        <w:spacing w:before="300" w:after="160"/>
+      </w:pPr>
+      <w:r>
+        <w:rPr>
+          <w:b/>
+          <w:bCs/>
+          <w:color w:val="2E75B6"/>
+          <w:sz w:val="28"/>
+          <w:szCs w:val="28"/>
+        </w:rPr>
+        <w:t xml:space="preserve">11.3 Feature Engineering</w:t>
+      </w:r>
+    </w:p>
+    <w:p>
+      <w:pPr>
+        <w:pStyle w:val="Heading3"/>
+        <w:spacing w:before="200" w:after="120"/>
+      </w:pPr>
+      <w:r>
+        <w:rPr>
+          <w:b/>
+          <w:bCs/>
+          <w:color w:val="1E293B"/>
+          <w:sz w:val="24"/>
+          <w:szCs w:val="24"/>
+        </w:rPr>
+        <w:t xml:space="preserve">11.3.1 Features para Largo Plazo (tmax diario)</w:t>
+      </w:r>
+    </w:p>
+    <w:p>
+      <w:pPr>
+        <w:spacing w:after="120" w:line="276"/>
+        <w:jc w:val="both"/>
+      </w:pPr>
+      <w:r>
+        <w:rPr>
+          <w:b w:val="false"/>
+          <w:bCs w:val="false"/>
+          <w:i w:val="false"/>
+          <w:iCs w:val="false"/>
+          <w:color w:val="1E293B"/>
+          <w:sz w:val="22"/>
+          <w:szCs w:val="22"/>
+        </w:rPr>
+        <w:t xml:space="preserve">La función build_largo_plazo_features() genera las siguientes características a partir de datos diarios de temperatura:</w:t>
+      </w:r>
+    </w:p>
+    <w:p>
+      <w:pPr>
+        <w:pStyle w:val="ListParagraph"/>
+        <w:numPr>
+          <w:ilvl w:val="0"/>
+          <w:numId w:val="2"/>
+        </w:numPr>
+        <w:spacing w:after="60"/>
+      </w:pPr>
+      <w:r>
+        <w:rPr>
+          <w:color w:val="1E293B"/>
+          <w:sz w:val="22"/>
+          <w:szCs w:val="22"/>
+        </w:rPr>
+        <w:t xml:space="preserve">Lag features: t-1, t-3, t-5, t-7 (temperatura de 1, 3, 5 y 7 días atrás).</w:t>
+      </w:r>
+    </w:p>
+    <w:p>
+      <w:pPr>
+        <w:pStyle w:val="ListParagraph"/>
+        <w:numPr>
+          <w:ilvl w:val="0"/>
+          <w:numId w:val="2"/>
+        </w:numPr>
+        <w:spacing w:after="60"/>
+      </w:pPr>
+      <w:r>
+        <w:rPr>
+          <w:color w:val="1E293B"/>
+          <w:sz w:val="22"/>
+          <w:szCs w:val="22"/>
+        </w:rPr>
+        <w:t xml:space="preserve">Rolling means: ventanas de 3, 7, 14 y 30 días sobre tmax.</w:t>
+      </w:r>
+    </w:p>
+    <w:p>
+      <w:pPr>
+        <w:pStyle w:val="ListParagraph"/>
+        <w:numPr>
+          <w:ilvl w:val="0"/>
+          <w:numId w:val="2"/>
+        </w:numPr>
+        <w:spacing w:after="60"/>
+      </w:pPr>
+      <w:r>
+        <w:rPr>
+          <w:color w:val="1E293B"/>
+          <w:sz w:val="22"/>
+          <w:szCs w:val="22"/>
+        </w:rPr>
+        <w:t xml:space="preserve">Rolling std: desviación estándar en ventanas de 7 y 14 días.</w:t>
+      </w:r>
+    </w:p>
+    <w:p>
+      <w:pPr>
+        <w:pStyle w:val="ListParagraph"/>
+        <w:numPr>
+          <w:ilvl w:val="0"/>
+          <w:numId w:val="2"/>
+        </w:numPr>
+        <w:spacing w:after="60"/>
+      </w:pPr>
+      <w:r>
+        <w:rPr>
+          <w:color w:val="1E293B"/>
+          <w:sz w:val="22"/>
+          <w:szCs w:val="22"/>
+        </w:rPr>
+        <w:t xml:space="preserve">Diferencia con rolling mean de 30 días (tmax - avg_30d).</w:t>
+      </w:r>
+    </w:p>
+    <w:p>
+      <w:pPr>
+        <w:pStyle w:val="ListParagraph"/>
+        <w:numPr>
+          <w:ilvl w:val="0"/>
+          <w:numId w:val="2"/>
+        </w:numPr>
+        <w:spacing w:after="60"/>
+      </w:pPr>
+      <w:r>
+        <w:rPr>
+          <w:color w:val="1E293B"/>
+          <w:sz w:val="22"/>
+          <w:szCs w:val="22"/>
+        </w:rPr>
+        <w:t xml:space="preserve">Tendencia: diferencia entre rolling mean de 7 y 30 días.</w:t>
+      </w:r>
+    </w:p>
+    <w:p>
+      <w:pPr>
+        <w:pStyle w:val="ListParagraph"/>
+        <w:numPr>
+          <w:ilvl w:val="0"/>
+          <w:numId w:val="2"/>
+        </w:numPr>
+        <w:spacing w:after="60"/>
+      </w:pPr>
+      <w:r>
+        <w:rPr>
+          <w:color w:val="1E293B"/>
+          <w:sz w:val="22"/>
+          <w:szCs w:val="22"/>
+        </w:rPr>
+        <w:t xml:space="preserve">Codificación temporal cíclica: mes y día transformados con seno/coseno.</w:t>
+      </w:r>
+    </w:p>
+    <w:p>
+      <w:pPr>
+        <w:pStyle w:val="ListParagraph"/>
+        <w:numPr>
+          <w:ilvl w:val="0"/>
+          <w:numId w:val="2"/>
+        </w:numPr>
+        <w:spacing w:after="60"/>
+      </w:pPr>
+      <w:r>
+        <w:rPr>
+          <w:color w:val="1E293B"/>
+          <w:sz w:val="22"/>
+          <w:szCs w:val="22"/>
+        </w:rPr>
+        <w:t xml:space="preserve">Características categóricas: estación del año (invierno/verano/otoño/primavera).</w:t>
+      </w:r>
+    </w:p>
+    <w:p>
+      <w:pPr>
+        <w:pStyle w:val="Heading3"/>
+        <w:spacing w:before="200" w:after="120"/>
+      </w:pPr>
+      <w:r>
+        <w:rPr>
+          <w:b/>
+          <w:bCs/>
+          <w:color w:val="1E293B"/>
+          <w:sz w:val="24"/>
+          <w:szCs w:val="24"/>
+        </w:rPr>
+        <w:t xml:space="preserve">11.3.2 Features para Corto Plazo (temperatura streaming)</w:t>
+      </w:r>
+    </w:p>
+    <w:p>
+      <w:pPr>
+        <w:spacing w:after="120" w:line="276"/>
+        <w:jc w:val="both"/>
+      </w:pPr>
+      <w:r>
+        <w:rPr>
+          <w:b w:val="false"/>
+          <w:bCs w:val="false"/>
+          <w:i w:val="false"/>
+          <w:iCs w:val="false"/>
+          <w:color w:val="1E293B"/>
+          <w:sz w:val="22"/>
+          <w:szCs w:val="22"/>
+        </w:rPr>
+        <w:t xml:space="preserve">La función build_corto_plazo_features() genera características a partir de mediciones cada ~5 minutos:</w:t>
+      </w:r>
+    </w:p>
+    <w:p>
+      <w:pPr>
+        <w:pStyle w:val="ListParagraph"/>
+        <w:numPr>
+          <w:ilvl w:val="0"/>
+          <w:numId w:val="2"/>
+        </w:numPr>
+        <w:spacing w:after="60"/>
+      </w:pPr>
+      <w:r>
+        <w:rPr>
+          <w:color w:val="1E293B"/>
+          <w:sz w:val="22"/>
+          <w:szCs w:val="22"/>
+        </w:rPr>
+        <w:t xml:space="preserve">Lag features: t-1 y t-3 (últimas 1 y 3 observaciones).</w:t>
+      </w:r>
+    </w:p>
+    <w:p>
+      <w:pPr>
+        <w:pStyle w:val="ListParagraph"/>
+        <w:numPr>
+          <w:ilvl w:val="0"/>
+          <w:numId w:val="2"/>
+        </w:numPr>
+        <w:spacing w:after="60"/>
+      </w:pPr>
+      <w:r>
+        <w:rPr>
+          <w:color w:val="1E293B"/>
+          <w:sz w:val="22"/>
+          <w:szCs w:val="22"/>
+        </w:rPr>
+        <w:t xml:space="preserve">Rolling mean: media móvil de 5 observaciones.</w:t>
+      </w:r>
+    </w:p>
+    <w:p>
+      <w:pPr>
+        <w:pStyle w:val="ListParagraph"/>
+        <w:numPr>
+          <w:ilvl w:val="0"/>
+          <w:numId w:val="2"/>
+        </w:numPr>
+        <w:spacing w:after="60"/>
+      </w:pPr>
+      <w:r>
+        <w:rPr>
+          <w:color w:val="1E293B"/>
+          <w:sz w:val="22"/>
+          <w:szCs w:val="22"/>
+        </w:rPr>
+        <w:t xml:space="preserve">Ratio presión/temperatura (presion / temperatura) como indicador de condiciones atmosféricas.</w:t>
+      </w:r>
+    </w:p>
+    <w:p>
+      <w:pPr>
+        <w:pStyle w:val="ListParagraph"/>
+        <w:numPr>
+          <w:ilvl w:val="0"/>
+          <w:numId w:val="2"/>
+        </w:numPr>
+        <w:spacing w:after="60"/>
+      </w:pPr>
+      <w:r>
+        <w:rPr>
+          <w:color w:val="1E293B"/>
+          <w:sz w:val="22"/>
+          <w:szCs w:val="22"/>
+        </w:rPr>
+        <w:t xml:space="preserve">Hora del día como variable cíclica (seno/coseno).</w:t>
+      </w:r>
+    </w:p>
+    <w:p>
+      <w:pPr>
+        <w:pStyle w:val="Heading2"/>
+        <w:spacing w:before="300" w:after="160"/>
+      </w:pPr>
+      <w:r>
+        <w:rPr>
+          <w:b/>
+          <w:bCs/>
+          <w:color w:val="2E75B6"/>
+          <w:sz w:val="28"/>
+          <w:szCs w:val="28"/>
+        </w:rPr>
+        <w:t xml:space="preserve">11.4 Entrenamiento de Modelos</w:t>
+      </w:r>
+    </w:p>
+    <w:p>
+      <w:pPr>
+        <w:pStyle w:val="Heading3"/>
+        <w:spacing w:before="200" w:after="120"/>
+      </w:pPr>
+      <w:r>
+        <w:rPr>
+          <w:b/>
+          <w:bCs/>
+          <w:color w:val="1E293B"/>
+          <w:sz w:val="24"/>
+          <w:szCs w:val="24"/>
+        </w:rPr>
+        <w:t xml:space="preserve">11.4.1 Largo Plazo — Datos SENAMHI</w:t>
+      </w:r>
+    </w:p>
+    <w:p>
+      <w:pPr>
+        <w:spacing w:after="120" w:line="276"/>
+        <w:jc w:val="both"/>
+      </w:pPr>
+      <w:r>
+        <w:rPr>
+          <w:b w:val="false"/>
+          <w:bCs w:val="false"/>
+          <w:i w:val="false"/>
+          <w:iCs w:val="false"/>
+          <w:color w:val="1E293B"/>
+          <w:sz w:val="22"/>
+          <w:szCs w:val="22"/>
+        </w:rPr>
+        <w:t xml:space="preserve">El script train_largo_plazo.py procesa los datos históricos de SENAMHI almacenados en Parquet particionado por departamento/provincia/distrito/año. El flujo de entrenamiento es:</w:t>
+      </w:r>
+    </w:p>
+    <w:p>
+      <w:pPr>
+        <w:pStyle w:val="ListParagraph"/>
+        <w:numPr>
+          <w:ilvl w:val="0"/>
+          <w:numId w:val="2"/>
+        </w:numPr>
+        <w:spacing w:after="60"/>
+      </w:pPr>
+      <w:r>
+        <w:rPr>
+          <w:color w:val="1E293B"/>
+          <w:sz w:val="22"/>
+          <w:szCs w:val="22"/>
+        </w:rPr>
+        <w:t xml:space="preserve">Lectura de Parquet: 2982 archivos, 60 estaciones, datos desde 1964 hasta 2012+.</w:t>
+      </w:r>
+    </w:p>
+    <w:p>
+      <w:pPr>
+        <w:pStyle w:val="ListParagraph"/>
+        <w:numPr>
+          <w:ilvl w:val="0"/>
+          <w:numId w:val="2"/>
+        </w:numPr>
+        <w:spacing w:after="60"/>
+      </w:pPr>
+      <w:r>
+        <w:rPr>
+          <w:color w:val="1E293B"/>
+          <w:sz w:val="22"/>
+          <w:szCs w:val="22"/>
+        </w:rPr>
+        <w:t xml:space="preserve">Filtrado: Selecciona estaciones con &gt;1000 registros de tmax (PUNO, AZANGARO, LAMPA, CAPACHICA).</w:t>
+      </w:r>
+    </w:p>
+    <w:p>
+      <w:pPr>
+        <w:pStyle w:val="ListParagraph"/>
+        <w:numPr>
+          <w:ilvl w:val="0"/>
+          <w:numId w:val="2"/>
+        </w:numPr>
+        <w:spacing w:after="60"/>
+      </w:pPr>
+      <w:r>
+        <w:rPr>
+          <w:color w:val="1E293B"/>
+          <w:sz w:val="22"/>
+          <w:szCs w:val="22"/>
+        </w:rPr>
+        <w:t xml:space="preserve">Preprocesamiento: Ordena por fecha para cada estación, elimina filas con tmax nulo.</w:t>
+      </w:r>
+    </w:p>
+    <w:p>
+      <w:pPr>
+        <w:pStyle w:val="ListParagraph"/>
+        <w:numPr>
+          <w:ilvl w:val="0"/>
+          <w:numId w:val="2"/>
+        </w:numPr>
+        <w:spacing w:after="60"/>
+      </w:pPr>
+      <w:r>
+        <w:rPr>
+          <w:color w:val="1E293B"/>
+          <w:sz w:val="22"/>
+          <w:szCs w:val="22"/>
+        </w:rPr>
+        <w:t xml:space="preserve">Feature engineering: build_largo_plazo_features() sobre secuencias ordenadas.</w:t>
+      </w:r>
+    </w:p>
+    <w:p>
+      <w:pPr>
+        <w:pStyle w:val="ListParagraph"/>
+        <w:numPr>
+          <w:ilvl w:val="0"/>
+          <w:numId w:val="2"/>
+        </w:numPr>
+        <w:spacing w:after="60"/>
+      </w:pPr>
+      <w:r>
+        <w:rPr>
+          <w:color w:val="1E293B"/>
+          <w:sz w:val="22"/>
+          <w:szCs w:val="22"/>
+        </w:rPr>
+        <w:t xml:space="preserve">División train/test: 80% entrenamiento, 20% prueba (últimos 20% cronológicos).</w:t>
+      </w:r>
+    </w:p>
+    <w:p>
+      <w:pPr>
+        <w:pStyle w:val="ListParagraph"/>
+        <w:numPr>
+          <w:ilvl w:val="0"/>
+          <w:numId w:val="2"/>
+        </w:numPr>
+        <w:spacing w:after="60"/>
+      </w:pPr>
+      <w:r>
+        <w:rPr>
+          <w:color w:val="1E293B"/>
+          <w:sz w:val="22"/>
+          <w:szCs w:val="22"/>
+        </w:rPr>
+        <w:t xml:space="preserve">Modelo: XGBoost Regressor con n_estimators=500, learning_rate=0.05, max_depth=7.</w:t>
+      </w:r>
+    </w:p>
+    <w:p>
+      <w:pPr>
+        <w:pStyle w:val="ListParagraph"/>
+        <w:numPr>
+          <w:ilvl w:val="0"/>
+          <w:numId w:val="2"/>
+        </w:numPr>
+        <w:spacing w:after="60"/>
+      </w:pPr>
+      <w:r>
+        <w:rPr>
+          <w:color w:val="1E293B"/>
+          <w:sz w:val="22"/>
+          <w:szCs w:val="22"/>
+        </w:rPr>
+        <w:t xml:space="preserve">Métricas: MAE, RMSE, R² calculados sobre conjunto de prueba.</w:t>
+      </w:r>
+    </w:p>
+    <w:p>
+      <w:pPr>
+        <w:pStyle w:val="Heading3"/>
+        <w:spacing w:before="200" w:after="120"/>
+      </w:pPr>
+      <w:r>
+        <w:rPr>
+          <w:b/>
+          <w:bCs/>
+          <w:color w:val="1E293B"/>
+          <w:sz w:val="24"/>
+          <w:szCs w:val="24"/>
+        </w:rPr>
+        <w:t xml:space="preserve">11.4.2 Corto Plazo — Datos Streaming</w:t>
+      </w:r>
+    </w:p>
+    <w:p>
+      <w:pPr>
+        <w:spacing w:after="120" w:line="276"/>
+        <w:jc w:val="both"/>
+      </w:pPr>
+      <w:r>
+        <w:rPr>
+          <w:b w:val="false"/>
+          <w:bCs w:val="false"/>
+          <w:i w:val="false"/>
+          <w:iCs w:val="false"/>
+          <w:color w:val="1E293B"/>
+          <w:sz w:val="22"/>
+          <w:szCs w:val="22"/>
+        </w:rPr>
+        <w:t xml:space="preserve">El script train_corto_plazo.py procesa los datos de sensores IoT almacenados en Parquet particionado por grupo. El flujo es:</w:t>
+      </w:r>
+    </w:p>
+    <w:p>
+      <w:pPr>
+        <w:pStyle w:val="ListParagraph"/>
+        <w:numPr>
+          <w:ilvl w:val="0"/>
+          <w:numId w:val="2"/>
+        </w:numPr>
+        <w:spacing w:after="60"/>
+      </w:pPr>
+      <w:r>
+        <w:rPr>
+          <w:color w:val="1E293B"/>
+          <w:sz w:val="22"/>
+          <w:szCs w:val="22"/>
+        </w:rPr>
+        <w:t xml:space="preserve">Lectura de Parquet streaming de los directorios grupo_2, grupo_3 y grupo_4.</w:t>
+      </w:r>
+    </w:p>
+    <w:p>
+      <w:pPr>
+        <w:pStyle w:val="ListParagraph"/>
+        <w:numPr>
+          <w:ilvl w:val="0"/>
+          <w:numId w:val="2"/>
+        </w:numPr>
+        <w:spacing w:after="60"/>
+      </w:pPr>
+      <w:r>
+        <w:rPr>
+          <w:color w:val="1E293B"/>
+          <w:sz w:val="22"/>
+          <w:szCs w:val="22"/>
+        </w:rPr>
+        <w:t xml:space="preserve">Selecciona las últimas 10000 observaciones de cada grupo para entrenamiento.</w:t>
+      </w:r>
+    </w:p>
+    <w:p>
+      <w:pPr>
+        <w:pStyle w:val="ListParagraph"/>
+        <w:numPr>
+          <w:ilvl w:val="0"/>
+          <w:numId w:val="2"/>
+        </w:numPr>
+        <w:spacing w:after="60"/>
+      </w:pPr>
+      <w:r>
+        <w:rPr>
+          <w:color w:val="1E293B"/>
+          <w:sz w:val="22"/>
+          <w:szCs w:val="22"/>
+        </w:rPr>
+        <w:t xml:space="preserve">Preprocesamiento: Ordena por created_at, elimina temperatura nula.</w:t>
+      </w:r>
+    </w:p>
+    <w:p>
+      <w:pPr>
+        <w:pStyle w:val="ListParagraph"/>
+        <w:numPr>
+          <w:ilvl w:val="0"/>
+          <w:numId w:val="2"/>
+        </w:numPr>
+        <w:spacing w:after="60"/>
+      </w:pPr>
+      <w:r>
+        <w:rPr>
+          <w:color w:val="1E293B"/>
+          <w:sz w:val="22"/>
+          <w:szCs w:val="22"/>
+        </w:rPr>
+        <w:t xml:space="preserve">Feature engineering: build_corto_plazo_features() sobre secuencias ordenadas.</w:t>
+      </w:r>
+    </w:p>
+    <w:p>
+      <w:pPr>
+        <w:pStyle w:val="ListParagraph"/>
+        <w:numPr>
+          <w:ilvl w:val="0"/>
+          <w:numId w:val="2"/>
+        </w:numPr>
+        <w:spacing w:after="60"/>
+      </w:pPr>
+      <w:r>
+        <w:rPr>
+          <w:color w:val="1E293B"/>
+          <w:sz w:val="22"/>
+          <w:szCs w:val="22"/>
+        </w:rPr>
+        <w:t xml:space="preserve">División train/test: 80% entrenamiento, 20% prueba.</w:t>
+      </w:r>
+    </w:p>
+    <w:p>
+      <w:pPr>
+        <w:pStyle w:val="ListParagraph"/>
+        <w:numPr>
+          <w:ilvl w:val="0"/>
+          <w:numId w:val="2"/>
+        </w:numPr>
+        <w:spacing w:after="60"/>
+      </w:pPr>
+      <w:r>
+        <w:rPr>
+          <w:color w:val="1E293B"/>
+          <w:sz w:val="22"/>
+          <w:szCs w:val="22"/>
+        </w:rPr>
+        <w:t xml:space="preserve">Modelo: XGBoost Regressor con n_estimators=300, learning_rate=0.05, max_depth=5.</w:t>
+      </w:r>
+    </w:p>
+    <w:p>
+      <w:pPr>
+        <w:pStyle w:val="Heading2"/>
+        <w:spacing w:before="300" w:after="160"/>
+      </w:pPr>
+      <w:r>
+        <w:rPr>
+          <w:b/>
+          <w:bCs/>
+          <w:color w:val="2E75B6"/>
+          <w:sz w:val="28"/>
+          <w:szCs w:val="28"/>
+        </w:rPr>
+        <w:t xml:space="preserve">11.5 Resultados y Métricas</w:t>
+      </w:r>
+    </w:p>
+    <w:p>
+      <w:pPr>
+        <w:pStyle w:val="Heading3"/>
+        <w:spacing w:before="200" w:after="120"/>
+      </w:pPr>
+      <w:r>
+        <w:rPr>
+          <w:b/>
+          <w:bCs/>
+          <w:color w:val="1E293B"/>
+          <w:sz w:val="24"/>
+          <w:szCs w:val="24"/>
+        </w:rPr>
+        <w:t xml:space="preserve">11.5.1 Modelos de Largo Plazo</w:t>
+      </w:r>
+    </w:p>
+    <w:tbl>
+      <w:tblPr>
+        <w:tblW w:type="dxa" w:w="9000"/>
+        <w:tblBorders>
+          <w:top w:val="single" w:color="auto" w:sz="4"/>
+          <w:left w:val="single" w:color="auto" w:sz="4"/>
+          <w:bottom w:val="single" w:color="auto" w:sz="4"/>
+          <w:right w:val="single" w:color="auto" w:sz="4"/>
+          <w:insideH w:val="single" w:color="auto" w:sz="4"/>
+          <w:insideV w:val="single" w:color="auto" w:sz="4"/>
+        </w:tblBorders>
+      </w:tblPr>
+      <w:tblGrid>
+        <w:gridCol w:w="3000"/>
+        <w:gridCol w:w="2000"/>
+        <w:gridCol w:w="2000"/>
+        <w:gridCol w:w="2000"/>
+      </w:tblGrid>
+      <w:tr>
+        <w:trPr>
+          <w:tblHeader/>
+        </w:trPr>
+        <w:tc>
+          <w:tcPr>
+            <w:tcW w:type="dxa" w:w="3000"/>
+            <w:tcBorders>
+              <w:top w:val="single" w:color="CBD5E1" w:sz="1"/>
+              <w:left w:val="single" w:color="CBD5E1" w:sz="1"/>
+              <w:bottom w:val="single" w:color="CBD5E1" w:sz="1"/>
+              <w:right w:val="single" w:color="CBD5E1" w:sz="1"/>
+            </w:tcBorders>
+            <w:shd w:fill="1B3A6B" w:val="clear"/>
+            <w:tcMar>
+              <w:top w:type="dxa" w:w="60"/>
+              <w:left w:type="dxa" w:w="100"/>
+              <w:bottom w:type="dxa" w:w="60"/>
+              <w:right w:type="dxa" w:w="100"/>
+            </w:tcMar>
+            <w:vAlign w:val="center"/>
+          </w:tcPr>
+          <w:p>
+            <w:pPr>
+              <w:jc w:val="center"/>
+            </w:pPr>
+            <w:r>
+              <w:rPr>
+                <w:b/>
+                <w:bCs/>
+                <w:color w:val="FFFFFF"/>
+                <w:sz w:val="20"/>
+                <w:szCs w:val="20"/>
+              </w:rPr>
+              <w:t xml:space="preserve">Estación</w:t>
+            </w:r>
+          </w:p>
+        </w:tc>
+        <w:tc>
+          <w:tcPr>
+            <w:tcW w:type="dxa" w:w="2000"/>
+            <w:tcBorders>
+              <w:top w:val="single" w:color="CBD5E1" w:sz="1"/>
+              <w:left w:val="single" w:color="CBD5E1" w:sz="1"/>
+              <w:bottom w:val="single" w:color="CBD5E1" w:sz="1"/>
+              <w:right w:val="single" w:color="CBD5E1" w:sz="1"/>
+            </w:tcBorders>
+            <w:shd w:fill="1B3A6B" w:val="clear"/>
+            <w:tcMar>
+              <w:top w:type="dxa" w:w="60"/>
+              <w:left w:type="dxa" w:w="100"/>
+              <w:bottom w:type="dxa" w:w="60"/>
+              <w:right w:type="dxa" w:w="100"/>
+            </w:tcMar>
+            <w:vAlign w:val="center"/>
+          </w:tcPr>
+          <w:p>
+            <w:pPr>
+              <w:jc w:val="center"/>
+            </w:pPr>
+            <w:r>
+              <w:rPr>
+                <w:b/>
+                <w:bCs/>
+                <w:color w:val="FFFFFF"/>
+                <w:sz w:val="20"/>
+                <w:szCs w:val="20"/>
+              </w:rPr>
+              <w:t xml:space="preserve">MAE (°C)</w:t>
+            </w:r>
+          </w:p>
+        </w:tc>
+        <w:tc>
+          <w:tcPr>
+            <w:tcW w:type="dxa" w:w="2000"/>
+            <w:tcBorders>
+              <w:top w:val="single" w:color="CBD5E1" w:sz="1"/>
+              <w:left w:val="single" w:color="CBD5E1" w:sz="1"/>
+              <w:bottom w:val="single" w:color="CBD5E1" w:sz="1"/>
+              <w:right w:val="single" w:color="CBD5E1" w:sz="1"/>
+            </w:tcBorders>
+            <w:shd w:fill="1B3A6B" w:val="clear"/>
+            <w:tcMar>
+              <w:top w:type="dxa" w:w="60"/>
+              <w:left w:type="dxa" w:w="100"/>
+              <w:bottom w:type="dxa" w:w="60"/>
+              <w:right w:type="dxa" w:w="100"/>
+            </w:tcMar>
+            <w:vAlign w:val="center"/>
+          </w:tcPr>
+          <w:p>
+            <w:pPr>
+              <w:jc w:val="center"/>
+            </w:pPr>
+            <w:r>
+              <w:rPr>
+                <w:b/>
+                <w:bCs/>
+                <w:color w:val="FFFFFF"/>
+                <w:sz w:val="20"/>
+                <w:szCs w:val="20"/>
+              </w:rPr>
+              <w:t xml:space="preserve">RMSE (°C)</w:t>
+            </w:r>
+          </w:p>
+        </w:tc>
+        <w:tc>
+          <w:tcPr>
+            <w:tcW w:type="dxa" w:w="2000"/>
+            <w:tcBorders>
+              <w:top w:val="single" w:color="CBD5E1" w:sz="1"/>
+              <w:left w:val="single" w:color="CBD5E1" w:sz="1"/>
+              <w:bottom w:val="single" w:color="CBD5E1" w:sz="1"/>
+              <w:right w:val="single" w:color="CBD5E1" w:sz="1"/>
+            </w:tcBorders>
+            <w:shd w:fill="1B3A6B" w:val="clear"/>
+            <w:tcMar>
+              <w:top w:type="dxa" w:w="60"/>
+              <w:left w:type="dxa" w:w="100"/>
+              <w:bottom w:type="dxa" w:w="60"/>
+              <w:right w:type="dxa" w:w="100"/>
+            </w:tcMar>
+            <w:vAlign w:val="center"/>
+          </w:tcPr>
+          <w:p>
+            <w:pPr>
+              <w:jc w:val="center"/>
+            </w:pPr>
+            <w:r>
+              <w:rPr>
+                <w:b/>
+                <w:bCs/>
+                <w:color w:val="FFFFFF"/>
+                <w:sz w:val="20"/>
+                <w:szCs w:val="20"/>
+              </w:rPr>
+              <w:t xml:space="preserve">R²</w:t>
+            </w:r>
+          </w:p>
+        </w:tc>
+      </w:tr>
+      <w:tr>
+        <w:tc>
+          <w:tcPr>
+            <w:tcW w:type="dxa" w:w="3000"/>
+            <w:tcBorders>
+              <w:top w:val="single" w:color="CBD5E1" w:sz="1"/>
+              <w:left w:val="single" w:color="CBD5E1" w:sz="1"/>
+              <w:bottom w:val="single" w:color="CBD5E1" w:sz="1"/>
+              <w:right w:val="single" w:color="CBD5E1" w:sz="1"/>
+            </w:tcBorders>
+            <w:shd w:fill="FFFFFF" w:val="clear"/>
+            <w:tcMar>
+              <w:top w:type="dxa" w:w="60"/>
+              <w:left w:type="dxa" w:w="100"/>
+              <w:bottom w:type="dxa" w:w="60"/>
+              <w:right w:type="dxa" w:w="100"/>
+            </w:tcMar>
+            <w:vAlign w:val="center"/>
+          </w:tcPr>
+          <w:p>
+            <w:pPr>
+              <w:jc w:val="left"/>
+            </w:pPr>
+            <w:r>
+              <w:rPr>
+                <w:b w:val="false"/>
+                <w:bCs w:val="false"/>
+                <w:color w:val="1E293B"/>
+                <w:sz w:val="20"/>
+                <w:szCs w:val="20"/>
+              </w:rPr>
+              <w:t xml:space="preserve">PUNO</w:t>
+            </w:r>
+          </w:p>
+        </w:tc>
+        <w:tc>
+          <w:tcPr>
+            <w:tcW w:type="dxa" w:w="2000"/>
+            <w:tcBorders>
+              <w:top w:val="single" w:color="CBD5E1" w:sz="1"/>
+              <w:left w:val="single" w:color="CBD5E1" w:sz="1"/>
+              <w:bottom w:val="single" w:color="CBD5E1" w:sz="1"/>
+              <w:right w:val="single" w:color="CBD5E1" w:sz="1"/>
+            </w:tcBorders>
+            <w:shd w:fill="FFFFFF" w:val="clear"/>
+            <w:tcMar>
+              <w:top w:type="dxa" w:w="60"/>
+              <w:left w:type="dxa" w:w="100"/>
+              <w:bottom w:type="dxa" w:w="60"/>
+              <w:right w:type="dxa" w:w="100"/>
+            </w:tcMar>
+            <w:vAlign w:val="center"/>
+          </w:tcPr>
+          <w:p>
+            <w:pPr>
+              <w:jc w:val="left"/>
+            </w:pPr>
+            <w:r>
+              <w:rPr>
+                <w:b w:val="false"/>
+                <w:bCs w:val="false"/>
+                <w:color w:val="1E293B"/>
+                <w:sz w:val="20"/>
+                <w:szCs w:val="20"/>
+              </w:rPr>
+              <w:t xml:space="preserve">0.08</w:t>
+            </w:r>
+          </w:p>
+        </w:tc>
+        <w:tc>
+          <w:tcPr>
+            <w:tcW w:type="dxa" w:w="2000"/>
+            <w:tcBorders>
+              <w:top w:val="single" w:color="CBD5E1" w:sz="1"/>
+              <w:left w:val="single" w:color="CBD5E1" w:sz="1"/>
+              <w:bottom w:val="single" w:color="CBD5E1" w:sz="1"/>
+              <w:right w:val="single" w:color="CBD5E1" w:sz="1"/>
+            </w:tcBorders>
+            <w:shd w:fill="FFFFFF" w:val="clear"/>
+            <w:tcMar>
+              <w:top w:type="dxa" w:w="60"/>
+              <w:left w:type="dxa" w:w="100"/>
+              <w:bottom w:type="dxa" w:w="60"/>
+              <w:right w:type="dxa" w:w="100"/>
+            </w:tcMar>
+            <w:vAlign w:val="center"/>
+          </w:tcPr>
+          <w:p>
+            <w:pPr>
+              <w:jc w:val="left"/>
+            </w:pPr>
+            <w:r>
+              <w:rPr>
+                <w:b w:val="false"/>
+                <w:bCs w:val="false"/>
+                <w:color w:val="1E293B"/>
+                <w:sz w:val="20"/>
+                <w:szCs w:val="20"/>
+              </w:rPr>
+              <w:t xml:space="preserve">0.20</w:t>
+            </w:r>
+          </w:p>
+        </w:tc>
+        <w:tc>
+          <w:tcPr>
+            <w:tcW w:type="dxa" w:w="2000"/>
+            <w:tcBorders>
+              <w:top w:val="single" w:color="CBD5E1" w:sz="1"/>
+              <w:left w:val="single" w:color="CBD5E1" w:sz="1"/>
+              <w:bottom w:val="single" w:color="CBD5E1" w:sz="1"/>
+              <w:right w:val="single" w:color="CBD5E1" w:sz="1"/>
+            </w:tcBorders>
+            <w:shd w:fill="FFFFFF" w:val="clear"/>
+            <w:tcMar>
+              <w:top w:type="dxa" w:w="60"/>
+              <w:left w:type="dxa" w:w="100"/>
+              <w:bottom w:type="dxa" w:w="60"/>
+              <w:right w:type="dxa" w:w="100"/>
+            </w:tcMar>
+            <w:vAlign w:val="center"/>
+          </w:tcPr>
+          <w:p>
+            <w:pPr>
+              <w:jc w:val="left"/>
+            </w:pPr>
+            <w:r>
+              <w:rPr>
+                <w:b w:val="false"/>
+                <w:bCs w:val="false"/>
+                <w:color w:val="1E293B"/>
+                <w:sz w:val="20"/>
+                <w:szCs w:val="20"/>
+              </w:rPr>
+              <w:t xml:space="preserve">0.994</w:t>
+            </w:r>
+          </w:p>
+        </w:tc>
+      </w:tr>
+      <w:tr>
+        <w:tc>
+          <w:tcPr>
+            <w:tcW w:type="dxa" w:w="3000"/>
+            <w:tcBorders>
+              <w:top w:val="single" w:color="CBD5E1" w:sz="1"/>
+              <w:left w:val="single" w:color="CBD5E1" w:sz="1"/>
+              <w:bottom w:val="single" w:color="CBD5E1" w:sz="1"/>
+              <w:right w:val="single" w:color="CBD5E1" w:sz="1"/>
+            </w:tcBorders>
+            <w:shd w:fill="F1F5F9" w:val="clear"/>
+            <w:tcMar>
+              <w:top w:type="dxa" w:w="60"/>
+              <w:left w:type="dxa" w:w="100"/>
+              <w:bottom w:type="dxa" w:w="60"/>
+              <w:right w:type="dxa" w:w="100"/>
+            </w:tcMar>
+            <w:vAlign w:val="center"/>
+          </w:tcPr>
+          <w:p>
+            <w:pPr>
+              <w:jc w:val="left"/>
+            </w:pPr>
+            <w:r>
+              <w:rPr>
+                <w:b w:val="false"/>
+                <w:bCs w:val="false"/>
+                <w:color w:val="1E293B"/>
+                <w:sz w:val="20"/>
+                <w:szCs w:val="20"/>
+              </w:rPr>
+              <w:t xml:space="preserve">AZANGARO</w:t>
+            </w:r>
+          </w:p>
+        </w:tc>
+        <w:tc>
+          <w:tcPr>
+            <w:tcW w:type="dxa" w:w="2000"/>
+            <w:tcBorders>
+              <w:top w:val="single" w:color="CBD5E1" w:sz="1"/>
+              <w:left w:val="single" w:color="CBD5E1" w:sz="1"/>
+              <w:bottom w:val="single" w:color="CBD5E1" w:sz="1"/>
+              <w:right w:val="single" w:color="CBD5E1" w:sz="1"/>
+            </w:tcBorders>
+            <w:shd w:fill="F1F5F9" w:val="clear"/>
+            <w:tcMar>
+              <w:top w:type="dxa" w:w="60"/>
+              <w:left w:type="dxa" w:w="100"/>
+              <w:bottom w:type="dxa" w:w="60"/>
+              <w:right w:type="dxa" w:w="100"/>
+            </w:tcMar>
+            <w:vAlign w:val="center"/>
+          </w:tcPr>
+          <w:p>
+            <w:pPr>
+              <w:jc w:val="left"/>
+            </w:pPr>
+            <w:r>
+              <w:rPr>
+                <w:b w:val="false"/>
+                <w:bCs w:val="false"/>
+                <w:color w:val="1E293B"/>
+                <w:sz w:val="20"/>
+                <w:szCs w:val="20"/>
+              </w:rPr>
+              <w:t xml:space="preserve">0.09</w:t>
+            </w:r>
+          </w:p>
+        </w:tc>
+        <w:tc>
+          <w:tcPr>
+            <w:tcW w:type="dxa" w:w="2000"/>
+            <w:tcBorders>
+              <w:top w:val="single" w:color="CBD5E1" w:sz="1"/>
+              <w:left w:val="single" w:color="CBD5E1" w:sz="1"/>
+              <w:bottom w:val="single" w:color="CBD5E1" w:sz="1"/>
+              <w:right w:val="single" w:color="CBD5E1" w:sz="1"/>
+            </w:tcBorders>
+            <w:shd w:fill="F1F5F9" w:val="clear"/>
+            <w:tcMar>
+              <w:top w:type="dxa" w:w="60"/>
+              <w:left w:type="dxa" w:w="100"/>
+              <w:bottom w:type="dxa" w:w="60"/>
+              <w:right w:type="dxa" w:w="100"/>
+            </w:tcMar>
+            <w:vAlign w:val="center"/>
+          </w:tcPr>
+          <w:p>
+            <w:pPr>
+              <w:jc w:val="left"/>
+            </w:pPr>
+            <w:r>
+              <w:rPr>
+                <w:b w:val="false"/>
+                <w:bCs w:val="false"/>
+                <w:color w:val="1E293B"/>
+                <w:sz w:val="20"/>
+                <w:szCs w:val="20"/>
+              </w:rPr>
+              <w:t xml:space="preserve">0.20</w:t>
+            </w:r>
+          </w:p>
+        </w:tc>
+        <w:tc>
+          <w:tcPr>
+            <w:tcW w:type="dxa" w:w="2000"/>
+            <w:tcBorders>
+              <w:top w:val="single" w:color="CBD5E1" w:sz="1"/>
+              <w:left w:val="single" w:color="CBD5E1" w:sz="1"/>
+              <w:bottom w:val="single" w:color="CBD5E1" w:sz="1"/>
+              <w:right w:val="single" w:color="CBD5E1" w:sz="1"/>
+            </w:tcBorders>
+            <w:shd w:fill="F1F5F9" w:val="clear"/>
+            <w:tcMar>
+              <w:top w:type="dxa" w:w="60"/>
+              <w:left w:type="dxa" w:w="100"/>
+              <w:bottom w:type="dxa" w:w="60"/>
+              <w:right w:type="dxa" w:w="100"/>
+            </w:tcMar>
+            <w:vAlign w:val="center"/>
+          </w:tcPr>
+          <w:p>
+            <w:pPr>
+              <w:jc w:val="left"/>
+            </w:pPr>
+            <w:r>
+              <w:rPr>
+                <w:b w:val="false"/>
+                <w:bCs w:val="false"/>
+                <w:color w:val="1E293B"/>
+                <w:sz w:val="20"/>
+                <w:szCs w:val="20"/>
+              </w:rPr>
+              <w:t xml:space="preserve">0.995</w:t>
+            </w:r>
+          </w:p>
+        </w:tc>
+      </w:tr>
+      <w:tr>
+        <w:tc>
+          <w:tcPr>
+            <w:tcW w:type="dxa" w:w="3000"/>
+            <w:tcBorders>
+              <w:top w:val="single" w:color="CBD5E1" w:sz="1"/>
+              <w:left w:val="single" w:color="CBD5E1" w:sz="1"/>
+              <w:bottom w:val="single" w:color="CBD5E1" w:sz="1"/>
+              <w:right w:val="single" w:color="CBD5E1" w:sz="1"/>
+            </w:tcBorders>
+            <w:shd w:fill="FFFFFF" w:val="clear"/>
+            <w:tcMar>
+              <w:top w:type="dxa" w:w="60"/>
+              <w:left w:type="dxa" w:w="100"/>
+              <w:bottom w:type="dxa" w:w="60"/>
+              <w:right w:type="dxa" w:w="100"/>
+            </w:tcMar>
+            <w:vAlign w:val="center"/>
+          </w:tcPr>
+          <w:p>
+            <w:pPr>
+              <w:jc w:val="left"/>
+            </w:pPr>
+            <w:r>
+              <w:rPr>
+                <w:b w:val="false"/>
+                <w:bCs w:val="false"/>
+                <w:color w:val="1E293B"/>
+                <w:sz w:val="20"/>
+                <w:szCs w:val="20"/>
+              </w:rPr>
+              <w:t xml:space="preserve">LAMPA</w:t>
+            </w:r>
+          </w:p>
+        </w:tc>
+        <w:tc>
+          <w:tcPr>
+            <w:tcW w:type="dxa" w:w="2000"/>
+            <w:tcBorders>
+              <w:top w:val="single" w:color="CBD5E1" w:sz="1"/>
+              <w:left w:val="single" w:color="CBD5E1" w:sz="1"/>
+              <w:bottom w:val="single" w:color="CBD5E1" w:sz="1"/>
+              <w:right w:val="single" w:color="CBD5E1" w:sz="1"/>
+            </w:tcBorders>
+            <w:shd w:fill="FFFFFF" w:val="clear"/>
+            <w:tcMar>
+              <w:top w:type="dxa" w:w="60"/>
+              <w:left w:type="dxa" w:w="100"/>
+              <w:bottom w:type="dxa" w:w="60"/>
+              <w:right w:type="dxa" w:w="100"/>
+            </w:tcMar>
+            <w:vAlign w:val="center"/>
+          </w:tcPr>
+          <w:p>
+            <w:pPr>
+              <w:jc w:val="left"/>
+            </w:pPr>
+            <w:r>
+              <w:rPr>
+                <w:b w:val="false"/>
+                <w:bCs w:val="false"/>
+                <w:color w:val="1E293B"/>
+                <w:sz w:val="20"/>
+                <w:szCs w:val="20"/>
+              </w:rPr>
+              <w:t xml:space="preserve">0.07</w:t>
+            </w:r>
+          </w:p>
+        </w:tc>
+        <w:tc>
+          <w:tcPr>
+            <w:tcW w:type="dxa" w:w="2000"/>
+            <w:tcBorders>
+              <w:top w:val="single" w:color="CBD5E1" w:sz="1"/>
+              <w:left w:val="single" w:color="CBD5E1" w:sz="1"/>
+              <w:bottom w:val="single" w:color="CBD5E1" w:sz="1"/>
+              <w:right w:val="single" w:color="CBD5E1" w:sz="1"/>
+            </w:tcBorders>
+            <w:shd w:fill="FFFFFF" w:val="clear"/>
+            <w:tcMar>
+              <w:top w:type="dxa" w:w="60"/>
+              <w:left w:type="dxa" w:w="100"/>
+              <w:bottom w:type="dxa" w:w="60"/>
+              <w:right w:type="dxa" w:w="100"/>
+            </w:tcMar>
+            <w:vAlign w:val="center"/>
+          </w:tcPr>
+          <w:p>
+            <w:pPr>
+              <w:jc w:val="left"/>
+            </w:pPr>
+            <w:r>
+              <w:rPr>
+                <w:b w:val="false"/>
+                <w:bCs w:val="false"/>
+                <w:color w:val="1E293B"/>
+                <w:sz w:val="20"/>
+                <w:szCs w:val="20"/>
+              </w:rPr>
+              <w:t xml:space="preserve">0.16</w:t>
+            </w:r>
+          </w:p>
+        </w:tc>
+        <w:tc>
+          <w:tcPr>
+            <w:tcW w:type="dxa" w:w="2000"/>
+            <w:tcBorders>
+              <w:top w:val="single" w:color="CBD5E1" w:sz="1"/>
+              <w:left w:val="single" w:color="CBD5E1" w:sz="1"/>
+              <w:bottom w:val="single" w:color="CBD5E1" w:sz="1"/>
+              <w:right w:val="single" w:color="CBD5E1" w:sz="1"/>
+            </w:tcBorders>
+            <w:shd w:fill="FFFFFF" w:val="clear"/>
+            <w:tcMar>
+              <w:top w:type="dxa" w:w="60"/>
+              <w:left w:type="dxa" w:w="100"/>
+              <w:bottom w:type="dxa" w:w="60"/>
+              <w:right w:type="dxa" w:w="100"/>
+            </w:tcMar>
+            <w:vAlign w:val="center"/>
+          </w:tcPr>
+          <w:p>
+            <w:pPr>
+              <w:jc w:val="left"/>
+            </w:pPr>
+            <w:r>
+              <w:rPr>
+                <w:b w:val="false"/>
+                <w:bCs w:val="false"/>
+                <w:color w:val="1E293B"/>
+                <w:sz w:val="20"/>
+                <w:szCs w:val="20"/>
+              </w:rPr>
+              <w:t xml:space="preserve">0.997</w:t>
+            </w:r>
+          </w:p>
+        </w:tc>
+      </w:tr>
+      <w:tr>
+        <w:tc>
+          <w:tcPr>
+            <w:tcW w:type="dxa" w:w="3000"/>
+            <w:tcBorders>
+              <w:top w:val="single" w:color="CBD5E1" w:sz="1"/>
+              <w:left w:val="single" w:color="CBD5E1" w:sz="1"/>
+              <w:bottom w:val="single" w:color="CBD5E1" w:sz="1"/>
+              <w:right w:val="single" w:color="CBD5E1" w:sz="1"/>
+            </w:tcBorders>
+            <w:shd w:fill="F1F5F9" w:val="clear"/>
+            <w:tcMar>
+              <w:top w:type="dxa" w:w="60"/>
+              <w:left w:type="dxa" w:w="100"/>
+              <w:bottom w:type="dxa" w:w="60"/>
+              <w:right w:type="dxa" w:w="100"/>
+            </w:tcMar>
+            <w:vAlign w:val="center"/>
+          </w:tcPr>
+          <w:p>
+            <w:pPr>
+              <w:jc w:val="left"/>
+            </w:pPr>
+            <w:r>
+              <w:rPr>
+                <w:b w:val="false"/>
+                <w:bCs w:val="false"/>
+                <w:color w:val="1E293B"/>
+                <w:sz w:val="20"/>
+                <w:szCs w:val="20"/>
+              </w:rPr>
+              <w:t xml:space="preserve">CAPACHICA</w:t>
+            </w:r>
+          </w:p>
+        </w:tc>
+        <w:tc>
+          <w:tcPr>
+            <w:tcW w:type="dxa" w:w="2000"/>
+            <w:tcBorders>
+              <w:top w:val="single" w:color="CBD5E1" w:sz="1"/>
+              <w:left w:val="single" w:color="CBD5E1" w:sz="1"/>
+              <w:bottom w:val="single" w:color="CBD5E1" w:sz="1"/>
+              <w:right w:val="single" w:color="CBD5E1" w:sz="1"/>
+            </w:tcBorders>
+            <w:shd w:fill="F1F5F9" w:val="clear"/>
+            <w:tcMar>
+              <w:top w:type="dxa" w:w="60"/>
+              <w:left w:type="dxa" w:w="100"/>
+              <w:bottom w:type="dxa" w:w="60"/>
+              <w:right w:type="dxa" w:w="100"/>
+            </w:tcMar>
+            <w:vAlign w:val="center"/>
+          </w:tcPr>
+          <w:p>
+            <w:pPr>
+              <w:jc w:val="left"/>
+            </w:pPr>
+            <w:r>
+              <w:rPr>
+                <w:b w:val="false"/>
+                <w:bCs w:val="false"/>
+                <w:color w:val="1E293B"/>
+                <w:sz w:val="20"/>
+                <w:szCs w:val="20"/>
+              </w:rPr>
+              <w:t xml:space="preserve">0.08</w:t>
+            </w:r>
+          </w:p>
+        </w:tc>
+        <w:tc>
+          <w:tcPr>
+            <w:tcW w:type="dxa" w:w="2000"/>
+            <w:tcBorders>
+              <w:top w:val="single" w:color="CBD5E1" w:sz="1"/>
+              <w:left w:val="single" w:color="CBD5E1" w:sz="1"/>
+              <w:bottom w:val="single" w:color="CBD5E1" w:sz="1"/>
+              <w:right w:val="single" w:color="CBD5E1" w:sz="1"/>
+            </w:tcBorders>
+            <w:shd w:fill="F1F5F9" w:val="clear"/>
+            <w:tcMar>
+              <w:top w:type="dxa" w:w="60"/>
+              <w:left w:type="dxa" w:w="100"/>
+              <w:bottom w:type="dxa" w:w="60"/>
+              <w:right w:type="dxa" w:w="100"/>
+            </w:tcMar>
+            <w:vAlign w:val="center"/>
+          </w:tcPr>
+          <w:p>
+            <w:pPr>
+              <w:jc w:val="left"/>
+            </w:pPr>
+            <w:r>
+              <w:rPr>
+                <w:b w:val="false"/>
+                <w:bCs w:val="false"/>
+                <w:color w:val="1E293B"/>
+                <w:sz w:val="20"/>
+                <w:szCs w:val="20"/>
+              </w:rPr>
+              <w:t xml:space="preserve">0.18</w:t>
+            </w:r>
+          </w:p>
+        </w:tc>
+        <w:tc>
+          <w:tcPr>
+            <w:tcW w:type="dxa" w:w="2000"/>
+            <w:tcBorders>
+              <w:top w:val="single" w:color="CBD5E1" w:sz="1"/>
+              <w:left w:val="single" w:color="CBD5E1" w:sz="1"/>
+              <w:bottom w:val="single" w:color="CBD5E1" w:sz="1"/>
+              <w:right w:val="single" w:color="CBD5E1" w:sz="1"/>
+            </w:tcBorders>
+            <w:shd w:fill="F1F5F9" w:val="clear"/>
+            <w:tcMar>
+              <w:top w:type="dxa" w:w="60"/>
+              <w:left w:type="dxa" w:w="100"/>
+              <w:bottom w:type="dxa" w:w="60"/>
+              <w:right w:type="dxa" w:w="100"/>
+            </w:tcMar>
+            <w:vAlign w:val="center"/>
+          </w:tcPr>
+          <w:p>
+            <w:pPr>
+              <w:jc w:val="left"/>
+            </w:pPr>
+            <w:r>
+              <w:rPr>
+                <w:b w:val="false"/>
+                <w:bCs w:val="false"/>
+                <w:color w:val="1E293B"/>
+                <w:sz w:val="20"/>
+                <w:szCs w:val="20"/>
+              </w:rPr>
+              <w:t xml:space="preserve">0.994</w:t>
+            </w:r>
+          </w:p>
+        </w:tc>
+      </w:tr>
+    </w:tbl>
+    <w:p>
+      <w:pPr>
+        <w:spacing w:after="120" w:line="276"/>
+        <w:jc w:val="both"/>
+      </w:pPr>
+      <w:r>
+        <w:rPr>
+          <w:b w:val="false"/>
+          <w:bCs w:val="false"/>
+          <w:i w:val="false"/>
+          <w:iCs w:val="false"/>
+          <w:color w:val="1E293B"/>
+          <w:sz w:val="22"/>
+          <w:szCs w:val="22"/>
+        </w:rPr>
+        <w:t xml:space="preserve">Los cuatro modelos de largo plazo alcanzan R² &gt; 0.99, demostrando alta precisión en la predicción de temperatura máxima diaria. LAMPA presenta el mejor rendimiento (MAE=0.07°C, R²=0.997). Estos resultados se explican por la naturaleza estacional y predecible del clima altiplánico.</w:t>
+      </w:r>
+    </w:p>
+    <w:p>
+      <w:pPr>
+        <w:pStyle w:val="Heading3"/>
+        <w:spacing w:before="200" w:after="120"/>
+      </w:pPr>
+      <w:r>
+        <w:rPr>
+          <w:b/>
+          <w:bCs/>
+          <w:color w:val="1E293B"/>
+          <w:sz w:val="24"/>
+          <w:szCs w:val="24"/>
+        </w:rPr>
+        <w:t xml:space="preserve">11.5.2 Modelos de Corto Plazo</w:t>
+      </w:r>
+    </w:p>
+    <w:tbl>
+      <w:tblPr>
+        <w:tblW w:type="dxa" w:w="9000"/>
+        <w:tblBorders>
+          <w:top w:val="single" w:color="auto" w:sz="4"/>
+          <w:left w:val="single" w:color="auto" w:sz="4"/>
+          <w:bottom w:val="single" w:color="auto" w:sz="4"/>
+          <w:right w:val="single" w:color="auto" w:sz="4"/>
+          <w:insideH w:val="single" w:color="auto" w:sz="4"/>
+          <w:insideV w:val="single" w:color="auto" w:sz="4"/>
+        </w:tblBorders>
+      </w:tblPr>
+      <w:tblGrid>
+        <w:gridCol w:w="2500"/>
+        <w:gridCol w:w="1500"/>
+        <w:gridCol w:w="1500"/>
+        <w:gridCol w:w="1500"/>
+        <w:gridCol w:w="2000"/>
+      </w:tblGrid>
+      <w:tr>
+        <w:trPr>
+          <w:tblHeader/>
+        </w:trPr>
+        <w:tc>
+          <w:tcPr>
+            <w:tcW w:type="dxa" w:w="2500"/>
+            <w:tcBorders>
+              <w:top w:val="single" w:color="CBD5E1" w:sz="1"/>
+              <w:left w:val="single" w:color="CBD5E1" w:sz="1"/>
+              <w:bottom w:val="single" w:color="CBD5E1" w:sz="1"/>
+              <w:right w:val="single" w:color="CBD5E1" w:sz="1"/>
+            </w:tcBorders>
+            <w:shd w:fill="1B3A6B" w:val="clear"/>
+            <w:tcMar>
+              <w:top w:type="dxa" w:w="60"/>
+              <w:left w:type="dxa" w:w="100"/>
+              <w:bottom w:type="dxa" w:w="60"/>
+              <w:right w:type="dxa" w:w="100"/>
+            </w:tcMar>
+            <w:vAlign w:val="center"/>
+          </w:tcPr>
+          <w:p>
+            <w:pPr>
+              <w:jc w:val="center"/>
+            </w:pPr>
+            <w:r>
+              <w:rPr>
+                <w:b/>
+                <w:bCs/>
+                <w:color w:val="FFFFFF"/>
+                <w:sz w:val="20"/>
+                <w:szCs w:val="20"/>
+              </w:rPr>
+              <w:t xml:space="preserve">Grupo / Estación</w:t>
+            </w:r>
+          </w:p>
+        </w:tc>
+        <w:tc>
+          <w:tcPr>
+            <w:tcW w:type="dxa" w:w="1500"/>
+            <w:tcBorders>
+              <w:top w:val="single" w:color="CBD5E1" w:sz="1"/>
+              <w:left w:val="single" w:color="CBD5E1" w:sz="1"/>
+              <w:bottom w:val="single" w:color="CBD5E1" w:sz="1"/>
+              <w:right w:val="single" w:color="CBD5E1" w:sz="1"/>
+            </w:tcBorders>
+            <w:shd w:fill="1B3A6B" w:val="clear"/>
+            <w:tcMar>
+              <w:top w:type="dxa" w:w="60"/>
+              <w:left w:type="dxa" w:w="100"/>
+              <w:bottom w:type="dxa" w:w="60"/>
+              <w:right w:type="dxa" w:w="100"/>
+            </w:tcMar>
+            <w:vAlign w:val="center"/>
+          </w:tcPr>
+          <w:p>
+            <w:pPr>
+              <w:jc w:val="center"/>
+            </w:pPr>
+            <w:r>
+              <w:rPr>
+                <w:b/>
+                <w:bCs/>
+                <w:color w:val="FFFFFF"/>
+                <w:sz w:val="20"/>
+                <w:szCs w:val="20"/>
+              </w:rPr>
+              <w:t xml:space="preserve">MAE (°C)</w:t>
+            </w:r>
+          </w:p>
+        </w:tc>
+        <w:tc>
+          <w:tcPr>
+            <w:tcW w:type="dxa" w:w="1500"/>
+            <w:tcBorders>
+              <w:top w:val="single" w:color="CBD5E1" w:sz="1"/>
+              <w:left w:val="single" w:color="CBD5E1" w:sz="1"/>
+              <w:bottom w:val="single" w:color="CBD5E1" w:sz="1"/>
+              <w:right w:val="single" w:color="CBD5E1" w:sz="1"/>
+            </w:tcBorders>
+            <w:shd w:fill="1B3A6B" w:val="clear"/>
+            <w:tcMar>
+              <w:top w:type="dxa" w:w="60"/>
+              <w:left w:type="dxa" w:w="100"/>
+              <w:bottom w:type="dxa" w:w="60"/>
+              <w:right w:type="dxa" w:w="100"/>
+            </w:tcMar>
+            <w:vAlign w:val="center"/>
+          </w:tcPr>
+          <w:p>
+            <w:pPr>
+              <w:jc w:val="center"/>
+            </w:pPr>
+            <w:r>
+              <w:rPr>
+                <w:b/>
+                <w:bCs/>
+                <w:color w:val="FFFFFF"/>
+                <w:sz w:val="20"/>
+                <w:szCs w:val="20"/>
+              </w:rPr>
+              <w:t xml:space="preserve">RMSE (°C)</w:t>
+            </w:r>
+          </w:p>
+        </w:tc>
+        <w:tc>
+          <w:tcPr>
+            <w:tcW w:type="dxa" w:w="1500"/>
+            <w:tcBorders>
+              <w:top w:val="single" w:color="CBD5E1" w:sz="1"/>
+              <w:left w:val="single" w:color="CBD5E1" w:sz="1"/>
+              <w:bottom w:val="single" w:color="CBD5E1" w:sz="1"/>
+              <w:right w:val="single" w:color="CBD5E1" w:sz="1"/>
+            </w:tcBorders>
+            <w:shd w:fill="1B3A6B" w:val="clear"/>
+            <w:tcMar>
+              <w:top w:type="dxa" w:w="60"/>
+              <w:left w:type="dxa" w:w="100"/>
+              <w:bottom w:type="dxa" w:w="60"/>
+              <w:right w:type="dxa" w:w="100"/>
+            </w:tcMar>
+            <w:vAlign w:val="center"/>
+          </w:tcPr>
+          <w:p>
+            <w:pPr>
+              <w:jc w:val="center"/>
+            </w:pPr>
+            <w:r>
+              <w:rPr>
+                <w:b/>
+                <w:bCs/>
+                <w:color w:val="FFFFFF"/>
+                <w:sz w:val="20"/>
+                <w:szCs w:val="20"/>
+              </w:rPr>
+              <w:t xml:space="preserve">R²</w:t>
+            </w:r>
+          </w:p>
+        </w:tc>
+        <w:tc>
+          <w:tcPr>
+            <w:tcW w:type="dxa" w:w="2000"/>
+            <w:tcBorders>
+              <w:top w:val="single" w:color="CBD5E1" w:sz="1"/>
+              <w:left w:val="single" w:color="CBD5E1" w:sz="1"/>
+              <w:bottom w:val="single" w:color="CBD5E1" w:sz="1"/>
+              <w:right w:val="single" w:color="CBD5E1" w:sz="1"/>
+            </w:tcBorders>
+            <w:shd w:fill="1B3A6B" w:val="clear"/>
+            <w:tcMar>
+              <w:top w:type="dxa" w:w="60"/>
+              <w:left w:type="dxa" w:w="100"/>
+              <w:bottom w:type="dxa" w:w="60"/>
+              <w:right w:type="dxa" w:w="100"/>
+            </w:tcMar>
+            <w:vAlign w:val="center"/>
+          </w:tcPr>
+          <w:p>
+            <w:pPr>
+              <w:jc w:val="center"/>
+            </w:pPr>
+            <w:r>
+              <w:rPr>
+                <w:b/>
+                <w:bCs/>
+                <w:color w:val="FFFFFF"/>
+                <w:sz w:val="20"/>
+                <w:szCs w:val="20"/>
+              </w:rPr>
+              <w:t xml:space="preserve">Estado</w:t>
+            </w:r>
+          </w:p>
+        </w:tc>
+      </w:tr>
+      <w:tr>
+        <w:tc>
+          <w:tcPr>
+            <w:tcW w:type="dxa" w:w="2500"/>
+            <w:tcBorders>
+              <w:top w:val="single" w:color="CBD5E1" w:sz="1"/>
+              <w:left w:val="single" w:color="CBD5E1" w:sz="1"/>
+              <w:bottom w:val="single" w:color="CBD5E1" w:sz="1"/>
+              <w:right w:val="single" w:color="CBD5E1" w:sz="1"/>
+            </w:tcBorders>
+            <w:shd w:fill="FFFFFF" w:val="clear"/>
+            <w:tcMar>
+              <w:top w:type="dxa" w:w="60"/>
+              <w:left w:type="dxa" w:w="100"/>
+              <w:bottom w:type="dxa" w:w="60"/>
+              <w:right w:type="dxa" w:w="100"/>
+            </w:tcMar>
+            <w:vAlign w:val="center"/>
+          </w:tcPr>
+          <w:p>
+            <w:pPr>
+              <w:jc w:val="left"/>
+            </w:pPr>
+            <w:r>
+              <w:rPr>
+                <w:b w:val="false"/>
+                <w:bCs w:val="false"/>
+                <w:color w:val="1E293B"/>
+                <w:sz w:val="20"/>
+                <w:szCs w:val="20"/>
+              </w:rPr>
+              <w:t xml:space="preserve">grupo_2 / LAMPA</w:t>
+            </w:r>
+          </w:p>
+        </w:tc>
+        <w:tc>
+          <w:tcPr>
+            <w:tcW w:type="dxa" w:w="1500"/>
+            <w:tcBorders>
+              <w:top w:val="single" w:color="CBD5E1" w:sz="1"/>
+              <w:left w:val="single" w:color="CBD5E1" w:sz="1"/>
+              <w:bottom w:val="single" w:color="CBD5E1" w:sz="1"/>
+              <w:right w:val="single" w:color="CBD5E1" w:sz="1"/>
+            </w:tcBorders>
+            <w:shd w:fill="FFFFFF" w:val="clear"/>
+            <w:tcMar>
+              <w:top w:type="dxa" w:w="60"/>
+              <w:left w:type="dxa" w:w="100"/>
+              <w:bottom w:type="dxa" w:w="60"/>
+              <w:right w:type="dxa" w:w="100"/>
+            </w:tcMar>
+            <w:vAlign w:val="center"/>
+          </w:tcPr>
+          <w:p>
+            <w:pPr>
+              <w:jc w:val="left"/>
+            </w:pPr>
+            <w:r>
+              <w:rPr>
+                <w:b w:val="false"/>
+                <w:bCs w:val="false"/>
+                <w:color w:val="1E293B"/>
+                <w:sz w:val="20"/>
+                <w:szCs w:val="20"/>
+              </w:rPr>
+              <w:t xml:space="preserve">0.044</w:t>
+            </w:r>
+          </w:p>
+        </w:tc>
+        <w:tc>
+          <w:tcPr>
+            <w:tcW w:type="dxa" w:w="1500"/>
+            <w:tcBorders>
+              <w:top w:val="single" w:color="CBD5E1" w:sz="1"/>
+              <w:left w:val="single" w:color="CBD5E1" w:sz="1"/>
+              <w:bottom w:val="single" w:color="CBD5E1" w:sz="1"/>
+              <w:right w:val="single" w:color="CBD5E1" w:sz="1"/>
+            </w:tcBorders>
+            <w:shd w:fill="FFFFFF" w:val="clear"/>
+            <w:tcMar>
+              <w:top w:type="dxa" w:w="60"/>
+              <w:left w:type="dxa" w:w="100"/>
+              <w:bottom w:type="dxa" w:w="60"/>
+              <w:right w:type="dxa" w:w="100"/>
+            </w:tcMar>
+            <w:vAlign w:val="center"/>
+          </w:tcPr>
+          <w:p>
+            <w:pPr>
+              <w:jc w:val="left"/>
+            </w:pPr>
+            <w:r>
+              <w:rPr>
+                <w:b w:val="false"/>
+                <w:bCs w:val="false"/>
+                <w:color w:val="1E293B"/>
+                <w:sz w:val="20"/>
+                <w:szCs w:val="20"/>
+              </w:rPr>
+              <w:t xml:space="preserve">0.106</w:t>
+            </w:r>
+          </w:p>
+        </w:tc>
+        <w:tc>
+          <w:tcPr>
+            <w:tcW w:type="dxa" w:w="1500"/>
+            <w:tcBorders>
+              <w:top w:val="single" w:color="CBD5E1" w:sz="1"/>
+              <w:left w:val="single" w:color="CBD5E1" w:sz="1"/>
+              <w:bottom w:val="single" w:color="CBD5E1" w:sz="1"/>
+              <w:right w:val="single" w:color="CBD5E1" w:sz="1"/>
+            </w:tcBorders>
+            <w:shd w:fill="FFFFFF" w:val="clear"/>
+            <w:tcMar>
+              <w:top w:type="dxa" w:w="60"/>
+              <w:left w:type="dxa" w:w="100"/>
+              <w:bottom w:type="dxa" w:w="60"/>
+              <w:right w:type="dxa" w:w="100"/>
+            </w:tcMar>
+            <w:vAlign w:val="center"/>
+          </w:tcPr>
+          <w:p>
+            <w:pPr>
+              <w:jc w:val="left"/>
+            </w:pPr>
+            <w:r>
+              <w:rPr>
+                <w:b w:val="false"/>
+                <w:bCs w:val="false"/>
+                <w:color w:val="1E293B"/>
+                <w:sz w:val="20"/>
+                <w:szCs w:val="20"/>
+              </w:rPr>
+              <w:t xml:space="preserve">0.992</w:t>
+            </w:r>
+          </w:p>
+        </w:tc>
+        <w:tc>
+          <w:tcPr>
+            <w:tcW w:type="dxa" w:w="2000"/>
+            <w:tcBorders>
+              <w:top w:val="single" w:color="CBD5E1" w:sz="1"/>
+              <w:left w:val="single" w:color="CBD5E1" w:sz="1"/>
+              <w:bottom w:val="single" w:color="CBD5E1" w:sz="1"/>
+              <w:right w:val="single" w:color="CBD5E1" w:sz="1"/>
+            </w:tcBorders>
+            <w:shd w:fill="FFFFFF" w:val="clear"/>
+            <w:tcMar>
+              <w:top w:type="dxa" w:w="60"/>
+              <w:left w:type="dxa" w:w="100"/>
+              <w:bottom w:type="dxa" w:w="60"/>
+              <w:right w:type="dxa" w:w="100"/>
+            </w:tcMar>
+            <w:vAlign w:val="center"/>
+          </w:tcPr>
+          <w:p>
+            <w:pPr>
+              <w:jc w:val="left"/>
+            </w:pPr>
+            <w:r>
+              <w:rPr>
+                <w:b w:val="false"/>
+                <w:bCs w:val="false"/>
+                <w:color w:val="1E293B"/>
+                <w:sz w:val="20"/>
+                <w:szCs w:val="20"/>
+              </w:rPr>
+              <w:t xml:space="preserve">OK</w:t>
+            </w:r>
+          </w:p>
+        </w:tc>
+      </w:tr>
+      <w:tr>
+        <w:tc>
+          <w:tcPr>
+            <w:tcW w:type="dxa" w:w="2500"/>
+            <w:tcBorders>
+              <w:top w:val="single" w:color="CBD5E1" w:sz="1"/>
+              <w:left w:val="single" w:color="CBD5E1" w:sz="1"/>
+              <w:bottom w:val="single" w:color="CBD5E1" w:sz="1"/>
+              <w:right w:val="single" w:color="CBD5E1" w:sz="1"/>
+            </w:tcBorders>
+            <w:shd w:fill="F1F5F9" w:val="clear"/>
+            <w:tcMar>
+              <w:top w:type="dxa" w:w="60"/>
+              <w:left w:type="dxa" w:w="100"/>
+              <w:bottom w:type="dxa" w:w="60"/>
+              <w:right w:type="dxa" w:w="100"/>
+            </w:tcMar>
+            <w:vAlign w:val="center"/>
+          </w:tcPr>
+          <w:p>
+            <w:pPr>
+              <w:jc w:val="left"/>
+            </w:pPr>
+            <w:r>
+              <w:rPr>
+                <w:b w:val="false"/>
+                <w:bCs w:val="false"/>
+                <w:color w:val="1E293B"/>
+                <w:sz w:val="20"/>
+                <w:szCs w:val="20"/>
+              </w:rPr>
+              <w:t xml:space="preserve">grupo_3 / PUNO</w:t>
+            </w:r>
+          </w:p>
+        </w:tc>
+        <w:tc>
+          <w:tcPr>
+            <w:tcW w:type="dxa" w:w="1500"/>
+            <w:tcBorders>
+              <w:top w:val="single" w:color="CBD5E1" w:sz="1"/>
+              <w:left w:val="single" w:color="CBD5E1" w:sz="1"/>
+              <w:bottom w:val="single" w:color="CBD5E1" w:sz="1"/>
+              <w:right w:val="single" w:color="CBD5E1" w:sz="1"/>
+            </w:tcBorders>
+            <w:shd w:fill="F1F5F9" w:val="clear"/>
+            <w:tcMar>
+              <w:top w:type="dxa" w:w="60"/>
+              <w:left w:type="dxa" w:w="100"/>
+              <w:bottom w:type="dxa" w:w="60"/>
+              <w:right w:type="dxa" w:w="100"/>
+            </w:tcMar>
+            <w:vAlign w:val="center"/>
+          </w:tcPr>
+          <w:p>
+            <w:pPr>
+              <w:jc w:val="left"/>
+            </w:pPr>
+            <w:r>
+              <w:rPr>
+                <w:b w:val="false"/>
+                <w:bCs w:val="false"/>
+                <w:color w:val="1E293B"/>
+                <w:sz w:val="20"/>
+                <w:szCs w:val="20"/>
+              </w:rPr>
+              <w:t xml:space="preserve">6.355</w:t>
+            </w:r>
+          </w:p>
+        </w:tc>
+        <w:tc>
+          <w:tcPr>
+            <w:tcW w:type="dxa" w:w="1500"/>
+            <w:tcBorders>
+              <w:top w:val="single" w:color="CBD5E1" w:sz="1"/>
+              <w:left w:val="single" w:color="CBD5E1" w:sz="1"/>
+              <w:bottom w:val="single" w:color="CBD5E1" w:sz="1"/>
+              <w:right w:val="single" w:color="CBD5E1" w:sz="1"/>
+            </w:tcBorders>
+            <w:shd w:fill="F1F5F9" w:val="clear"/>
+            <w:tcMar>
+              <w:top w:type="dxa" w:w="60"/>
+              <w:left w:type="dxa" w:w="100"/>
+              <w:bottom w:type="dxa" w:w="60"/>
+              <w:right w:type="dxa" w:w="100"/>
+            </w:tcMar>
+            <w:vAlign w:val="center"/>
+          </w:tcPr>
+          <w:p>
+            <w:pPr>
+              <w:jc w:val="left"/>
+            </w:pPr>
+            <w:r>
+              <w:rPr>
+                <w:b w:val="false"/>
+                <w:bCs w:val="false"/>
+                <w:color w:val="1E293B"/>
+                <w:sz w:val="20"/>
+                <w:szCs w:val="20"/>
+              </w:rPr>
+              <w:t xml:space="preserve">9.810</w:t>
+            </w:r>
+          </w:p>
+        </w:tc>
+        <w:tc>
+          <w:tcPr>
+            <w:tcW w:type="dxa" w:w="1500"/>
+            <w:tcBorders>
+              <w:top w:val="single" w:color="CBD5E1" w:sz="1"/>
+              <w:left w:val="single" w:color="CBD5E1" w:sz="1"/>
+              <w:bottom w:val="single" w:color="CBD5E1" w:sz="1"/>
+              <w:right w:val="single" w:color="CBD5E1" w:sz="1"/>
+            </w:tcBorders>
+            <w:shd w:fill="F1F5F9" w:val="clear"/>
+            <w:tcMar>
+              <w:top w:type="dxa" w:w="60"/>
+              <w:left w:type="dxa" w:w="100"/>
+              <w:bottom w:type="dxa" w:w="60"/>
+              <w:right w:type="dxa" w:w="100"/>
+            </w:tcMar>
+            <w:vAlign w:val="center"/>
+          </w:tcPr>
+          <w:p>
+            <w:pPr>
+              <w:jc w:val="left"/>
+            </w:pPr>
+            <w:r>
+              <w:rPr>
+                <w:b w:val="false"/>
+                <w:bCs w:val="false"/>
+                <w:color w:val="1E293B"/>
+                <w:sz w:val="20"/>
+                <w:szCs w:val="20"/>
+              </w:rPr>
+              <w:t xml:space="preserve">-1.410</w:t>
+            </w:r>
+          </w:p>
+        </w:tc>
+        <w:tc>
+          <w:tcPr>
+            <w:tcW w:type="dxa" w:w="2000"/>
+            <w:tcBorders>
+              <w:top w:val="single" w:color="CBD5E1" w:sz="1"/>
+              <w:left w:val="single" w:color="CBD5E1" w:sz="1"/>
+              <w:bottom w:val="single" w:color="CBD5E1" w:sz="1"/>
+              <w:right w:val="single" w:color="CBD5E1" w:sz="1"/>
+            </w:tcBorders>
+            <w:shd w:fill="F1F5F9" w:val="clear"/>
+            <w:tcMar>
+              <w:top w:type="dxa" w:w="60"/>
+              <w:left w:type="dxa" w:w="100"/>
+              <w:bottom w:type="dxa" w:w="60"/>
+              <w:right w:type="dxa" w:w="100"/>
+            </w:tcMar>
+            <w:vAlign w:val="center"/>
+          </w:tcPr>
+          <w:p>
+            <w:pPr>
+              <w:jc w:val="left"/>
+            </w:pPr>
+            <w:r>
+              <w:rPr>
+                <w:b w:val="false"/>
+                <w:bCs w:val="false"/>
+                <w:color w:val="1E293B"/>
+                <w:sz w:val="20"/>
+                <w:szCs w:val="20"/>
+              </w:rPr>
+              <w:t xml:space="preserve">Sensor defectuoso</w:t>
+            </w:r>
+          </w:p>
+        </w:tc>
+      </w:tr>
+      <w:tr>
+        <w:tc>
+          <w:tcPr>
+            <w:tcW w:type="dxa" w:w="2500"/>
+            <w:tcBorders>
+              <w:top w:val="single" w:color="CBD5E1" w:sz="1"/>
+              <w:left w:val="single" w:color="CBD5E1" w:sz="1"/>
+              <w:bottom w:val="single" w:color="CBD5E1" w:sz="1"/>
+              <w:right w:val="single" w:color="CBD5E1" w:sz="1"/>
+            </w:tcBorders>
+            <w:shd w:fill="FFFFFF" w:val="clear"/>
+            <w:tcMar>
+              <w:top w:type="dxa" w:w="60"/>
+              <w:left w:type="dxa" w:w="100"/>
+              <w:bottom w:type="dxa" w:w="60"/>
+              <w:right w:type="dxa" w:w="100"/>
+            </w:tcMar>
+            <w:vAlign w:val="center"/>
+          </w:tcPr>
+          <w:p>
+            <w:pPr>
+              <w:jc w:val="left"/>
+            </w:pPr>
+            <w:r>
+              <w:rPr>
+                <w:b w:val="false"/>
+                <w:bCs w:val="false"/>
+                <w:color w:val="1E293B"/>
+                <w:sz w:val="20"/>
+                <w:szCs w:val="20"/>
+              </w:rPr>
+              <w:t xml:space="preserve">grupo_4 / AZANGARO</w:t>
+            </w:r>
+          </w:p>
+        </w:tc>
+        <w:tc>
+          <w:tcPr>
+            <w:tcW w:type="dxa" w:w="1500"/>
+            <w:tcBorders>
+              <w:top w:val="single" w:color="CBD5E1" w:sz="1"/>
+              <w:left w:val="single" w:color="CBD5E1" w:sz="1"/>
+              <w:bottom w:val="single" w:color="CBD5E1" w:sz="1"/>
+              <w:right w:val="single" w:color="CBD5E1" w:sz="1"/>
+            </w:tcBorders>
+            <w:shd w:fill="FFFFFF" w:val="clear"/>
+            <w:tcMar>
+              <w:top w:type="dxa" w:w="60"/>
+              <w:left w:type="dxa" w:w="100"/>
+              <w:bottom w:type="dxa" w:w="60"/>
+              <w:right w:type="dxa" w:w="100"/>
+            </w:tcMar>
+            <w:vAlign w:val="center"/>
+          </w:tcPr>
+          <w:p>
+            <w:pPr>
+              <w:jc w:val="left"/>
+            </w:pPr>
+            <w:r>
+              <w:rPr>
+                <w:b w:val="false"/>
+                <w:bCs w:val="false"/>
+                <w:color w:val="1E293B"/>
+                <w:sz w:val="20"/>
+                <w:szCs w:val="20"/>
+              </w:rPr>
+              <w:t xml:space="preserve">0.053</w:t>
+            </w:r>
+          </w:p>
+        </w:tc>
+        <w:tc>
+          <w:tcPr>
+            <w:tcW w:type="dxa" w:w="1500"/>
+            <w:tcBorders>
+              <w:top w:val="single" w:color="CBD5E1" w:sz="1"/>
+              <w:left w:val="single" w:color="CBD5E1" w:sz="1"/>
+              <w:bottom w:val="single" w:color="CBD5E1" w:sz="1"/>
+              <w:right w:val="single" w:color="CBD5E1" w:sz="1"/>
+            </w:tcBorders>
+            <w:shd w:fill="FFFFFF" w:val="clear"/>
+            <w:tcMar>
+              <w:top w:type="dxa" w:w="60"/>
+              <w:left w:type="dxa" w:w="100"/>
+              <w:bottom w:type="dxa" w:w="60"/>
+              <w:right w:type="dxa" w:w="100"/>
+            </w:tcMar>
+            <w:vAlign w:val="center"/>
+          </w:tcPr>
+          <w:p>
+            <w:pPr>
+              <w:jc w:val="left"/>
+            </w:pPr>
+            <w:r>
+              <w:rPr>
+                <w:b w:val="false"/>
+                <w:bCs w:val="false"/>
+                <w:color w:val="1E293B"/>
+                <w:sz w:val="20"/>
+                <w:szCs w:val="20"/>
+              </w:rPr>
+              <w:t xml:space="preserve">0.096</w:t>
+            </w:r>
+          </w:p>
+        </w:tc>
+        <w:tc>
+          <w:tcPr>
+            <w:tcW w:type="dxa" w:w="1500"/>
+            <w:tcBorders>
+              <w:top w:val="single" w:color="CBD5E1" w:sz="1"/>
+              <w:left w:val="single" w:color="CBD5E1" w:sz="1"/>
+              <w:bottom w:val="single" w:color="CBD5E1" w:sz="1"/>
+              <w:right w:val="single" w:color="CBD5E1" w:sz="1"/>
+            </w:tcBorders>
+            <w:shd w:fill="FFFFFF" w:val="clear"/>
+            <w:tcMar>
+              <w:top w:type="dxa" w:w="60"/>
+              <w:left w:type="dxa" w:w="100"/>
+              <w:bottom w:type="dxa" w:w="60"/>
+              <w:right w:type="dxa" w:w="100"/>
+            </w:tcMar>
+            <w:vAlign w:val="center"/>
+          </w:tcPr>
+          <w:p>
+            <w:pPr>
+              <w:jc w:val="left"/>
+            </w:pPr>
+            <w:r>
+              <w:rPr>
+                <w:b w:val="false"/>
+                <w:bCs w:val="false"/>
+                <w:color w:val="1E293B"/>
+                <w:sz w:val="20"/>
+                <w:szCs w:val="20"/>
+              </w:rPr>
+              <w:t xml:space="preserve">0.993</w:t>
+            </w:r>
+          </w:p>
+        </w:tc>
+        <w:tc>
+          <w:tcPr>
+            <w:tcW w:type="dxa" w:w="2000"/>
+            <w:tcBorders>
+              <w:top w:val="single" w:color="CBD5E1" w:sz="1"/>
+              <w:left w:val="single" w:color="CBD5E1" w:sz="1"/>
+              <w:bottom w:val="single" w:color="CBD5E1" w:sz="1"/>
+              <w:right w:val="single" w:color="CBD5E1" w:sz="1"/>
+            </w:tcBorders>
+            <w:shd w:fill="FFFFFF" w:val="clear"/>
+            <w:tcMar>
+              <w:top w:type="dxa" w:w="60"/>
+              <w:left w:type="dxa" w:w="100"/>
+              <w:bottom w:type="dxa" w:w="60"/>
+              <w:right w:type="dxa" w:w="100"/>
+            </w:tcMar>
+            <w:vAlign w:val="center"/>
+          </w:tcPr>
+          <w:p>
+            <w:pPr>
+              <w:jc w:val="left"/>
+            </w:pPr>
+            <w:r>
+              <w:rPr>
+                <w:b w:val="false"/>
+                <w:bCs w:val="false"/>
+                <w:color w:val="1E293B"/>
+                <w:sz w:val="20"/>
+                <w:szCs w:val="20"/>
+              </w:rPr>
+              <w:t xml:space="preserve">OK</w:t>
+            </w:r>
+          </w:p>
+        </w:tc>
+      </w:tr>
+    </w:tbl>
+    <w:p>
+      <w:pPr>
+        <w:spacing w:after="120" w:line="276"/>
+        <w:jc w:val="both"/>
+      </w:pPr>
+      <w:r>
+        <w:rPr>
+          <w:b w:val="false"/>
+          <w:bCs w:val="false"/>
+          <w:i w:val="false"/>
+          <w:iCs w:val="false"/>
+          <w:color w:val="1E293B"/>
+          <w:sz w:val="22"/>
+          <w:szCs w:val="22"/>
+        </w:rPr>
+        <w:t xml:space="preserve">Los modelos de corto plazo para sensores con datos de calidad (grupo_2 y grupo_4) alcanzan R² &gt; 0.99 con MAE &lt; 0.06°C. El grupo_3 presenta datos anómalos: presión atmosférica de 186 hPa (vs ~646 hPa en los otros grupos) y temperatura constante de aproximadamente -0.06°C, lo que indica un sensor defectuoso. Esto resulta en un R² negativo (-1.41) y MAE elevado (6.36°C).</w:t>
+      </w:r>
+    </w:p>
+    <w:p>
+      <w:pPr>
+        <w:pStyle w:val="Heading2"/>
+        <w:spacing w:before="300" w:after="160"/>
+      </w:pPr>
+      <w:r>
+        <w:rPr>
+          <w:b/>
+          <w:bCs/>
+          <w:color w:val="2E75B6"/>
+          <w:sz w:val="28"/>
+          <w:szCs w:val="28"/>
+        </w:rPr>
+        <w:t xml:space="preserve">11.6 Predicción en Tiempo Real (Dashboard)</w:t>
+      </w:r>
+    </w:p>
+    <w:p>
+      <w:pPr>
+        <w:spacing w:after="120" w:line="276"/>
+        <w:jc w:val="both"/>
+      </w:pPr>
+      <w:r>
+        <w:rPr>
+          <w:b w:val="false"/>
+          <w:bCs w:val="false"/>
+          <w:i w:val="false"/>
+          <w:iCs w:val="false"/>
+          <w:color w:val="1E293B"/>
+          <w:sz w:val="22"/>
+          <w:szCs w:val="22"/>
+        </w:rPr>
+        <w:t xml:space="preserve">La función render_ml_predictions() en dashboard/app.py proporciona una interfaz interactiva con:</w:t>
+      </w:r>
+    </w:p>
+    <w:p>
+      <w:pPr>
+        <w:pStyle w:val="ListParagraph"/>
+        <w:numPr>
+          <w:ilvl w:val="0"/>
+          <w:numId w:val="2"/>
+        </w:numPr>
+        <w:spacing w:after="60"/>
+      </w:pPr>
+      <w:r>
+        <w:rPr>
+          <w:color w:val="1E293B"/>
+          <w:sz w:val="22"/>
+          <w:szCs w:val="22"/>
+        </w:rPr>
+        <w:t xml:space="preserve">Selector de horizonte: Largo Plazo (tmax diario) o Corto Plazo (temperatura inmediata).</w:t>
+      </w:r>
+    </w:p>
+    <w:p>
+      <w:pPr>
+        <w:pStyle w:val="ListParagraph"/>
+        <w:numPr>
+          <w:ilvl w:val="0"/>
+          <w:numId w:val="2"/>
+        </w:numPr>
+        <w:spacing w:after="60"/>
+      </w:pPr>
+      <w:r>
+        <w:rPr>
+          <w:color w:val="1E293B"/>
+          <w:sz w:val="22"/>
+          <w:szCs w:val="22"/>
+        </w:rPr>
+        <w:t xml:space="preserve">Selector de estación: dinámico según el horizonte seleccionado.</w:t>
+      </w:r>
+    </w:p>
+    <w:p>
+      <w:pPr>
+        <w:pStyle w:val="ListParagraph"/>
+        <w:numPr>
+          <w:ilvl w:val="0"/>
+          <w:numId w:val="2"/>
+        </w:numPr>
+        <w:spacing w:after="60"/>
+      </w:pPr>
+      <w:r>
+        <w:rPr>
+          <w:color w:val="1E293B"/>
+          <w:sz w:val="22"/>
+          <w:szCs w:val="22"/>
+        </w:rPr>
+        <w:t xml:space="preserve">Fecha de predicción: control date_input para especificar el día de predicción (largo plazo).</w:t>
+      </w:r>
+    </w:p>
+    <w:p>
+      <w:pPr>
+        <w:pStyle w:val="ListParagraph"/>
+        <w:numPr>
+          <w:ilvl w:val="0"/>
+          <w:numId w:val="2"/>
+        </w:numPr>
+        <w:spacing w:after="60"/>
+      </w:pPr>
+      <w:r>
+        <w:rPr>
+          <w:color w:val="1E293B"/>
+          <w:sz w:val="22"/>
+          <w:szCs w:val="22"/>
+        </w:rPr>
+        <w:t xml:space="preserve">Botón 'Predecir': ejecuta la predicción y muestra resultados.</w:t>
+      </w:r>
+    </w:p>
+    <w:p>
+      <w:pPr>
+        <w:pStyle w:val="ListParagraph"/>
+        <w:numPr>
+          <w:ilvl w:val="0"/>
+          <w:numId w:val="2"/>
+        </w:numPr>
+        <w:spacing w:after="60"/>
+      </w:pPr>
+      <w:r>
+        <w:rPr>
+          <w:color w:val="1E293B"/>
+          <w:sz w:val="22"/>
+          <w:szCs w:val="22"/>
+        </w:rPr>
+        <w:t xml:space="preserve">Visualización de resultados: tarjeta con temperatura predicha, MAE, RMSE y R² del modelo.</w:t>
+      </w:r>
+    </w:p>
+    <w:p>
+      <w:pPr>
+        <w:spacing w:after="120" w:line="276"/>
+        <w:jc w:val="both"/>
+      </w:pPr>
+      <w:r>
+        <w:rPr>
+          <w:b w:val="false"/>
+          <w:bCs w:val="false"/>
+          <w:i w:val="false"/>
+          <w:iCs w:val="false"/>
+          <w:color w:val="1E293B"/>
+          <w:sz w:val="22"/>
+          <w:szCs w:val="22"/>
+        </w:rPr>
+        <w:t xml:space="preserve">Las predicciones se almacenan en st.session_state.ml_lp_result y st.session_state.ml_cp_result para persistir entre reruns automáticos del dashboard (streamlit-autorefresh cada 2 segundos en la pestaña de tiempo real).</w:t>
+      </w:r>
+    </w:p>
+    <w:p>
+      <w:pPr>
+        <w:pStyle w:val="Heading2"/>
+        <w:spacing w:before="300" w:after="160"/>
+      </w:pPr>
+      <w:r>
+        <w:rPr>
+          <w:b/>
+          <w:bCs/>
+          <w:color w:val="2E75B6"/>
+          <w:sz w:val="28"/>
+          <w:szCs w:val="28"/>
+        </w:rPr>
+        <w:t xml:space="preserve">11.7 Optimización de Rendimiento</w:t>
+      </w:r>
+    </w:p>
+    <w:p>
+      <w:pPr>
+        <w:spacing w:after="120" w:line="276"/>
+        <w:jc w:val="both"/>
+      </w:pPr>
+      <w:r>
+        <w:rPr>
+          <w:b w:val="false"/>
+          <w:bCs w:val="false"/>
+          <w:i w:val="false"/>
+          <w:iCs w:val="false"/>
+          <w:color w:val="1E293B"/>
+          <w:sz w:val="22"/>
+          <w:szCs w:val="22"/>
+        </w:rPr>
+        <w:t xml:space="preserve">Durante la implementación se identificaron y resolvieron los siguientes cuellos de botella:</w:t>
+      </w:r>
+    </w:p>
+    <w:p>
+      <w:pPr>
+        <w:pStyle w:val="ListParagraph"/>
+        <w:numPr>
+          <w:ilvl w:val="0"/>
+          <w:numId w:val="2"/>
+        </w:numPr>
+        <w:spacing w:after="60"/>
+      </w:pPr>
+      <w:r>
+        <w:rPr>
+          <w:color w:val="1E293B"/>
+          <w:sz w:val="22"/>
+          <w:szCs w:val="22"/>
+        </w:rPr>
+        <w:t xml:space="preserve">Problema original: predict_largo_plazo() escaneaba todos los 2982 archivos Parquet (todos los departamentos/estaciones) usando glob('**/*.parquet'), tomando varios minutos por predicción.</w:t>
+      </w:r>
+    </w:p>
+    <w:p>
+      <w:pPr>
+        <w:pStyle w:val="ListParagraph"/>
+        <w:numPr>
+          <w:ilvl w:val="0"/>
+          <w:numId w:val="2"/>
+        </w:numPr>
+        <w:spacing w:after="60"/>
+      </w:pPr>
+      <w:r>
+        <w:rPr>
+          <w:color w:val="1E293B"/>
+          <w:sz w:val="22"/>
+          <w:szCs w:val="22"/>
+        </w:rPr>
+        <w:t xml:space="preserve">Solución: Se implementó STATION_DIR_MAP que mapea cada estación al subdirectorio específico de Parquet. La función ahora construye la ruta directa artefacts/weather_data/{dept}/{prov}/{district}/{year}/, reduciendo el tiempo de predicción de ~minutos a ~1.5 segundos.</w:t>
+      </w:r>
+    </w:p>
+    <w:p>
+      <w:pPr>
+        <w:pStyle w:val="ListParagraph"/>
+        <w:numPr>
+          <w:ilvl w:val="0"/>
+          <w:numId w:val="2"/>
+        </w:numPr>
+        <w:spacing w:after="60"/>
+      </w:pPr>
+      <w:r>
+        <w:rPr>
+          <w:color w:val="1E293B"/>
+          <w:sz w:val="22"/>
+          <w:szCs w:val="22"/>
+        </w:rPr>
+        <w:t xml:space="preserve">Persistencia de modelos: Los modelos .pkl se guardan en ml/models/ montado como volumen Docker, evitando retrain en cada recreación del contenedor.</w:t>
+      </w:r>
+    </w:p>
+    <w:p>
+      <w:pPr>
+        <w:pStyle w:val="Heading2"/>
+        <w:spacing w:before="300" w:after="160"/>
+      </w:pPr>
+      <w:r>
+        <w:rPr>
+          <w:b/>
+          <w:bCs/>
+          <w:color w:val="2E75B6"/>
+          <w:sz w:val="28"/>
+          <w:szCs w:val="28"/>
+        </w:rPr>
+        <w:t xml:space="preserve">11.8 Limitaciones de los Modelos ML</w:t>
+      </w:r>
+    </w:p>
+    <w:p>
+      <w:pPr>
+        <w:pStyle w:val="ListParagraph"/>
+        <w:numPr>
+          <w:ilvl w:val="0"/>
+          <w:numId w:val="2"/>
+        </w:numPr>
+        <w:spacing w:after="60"/>
+      </w:pPr>
+      <w:r>
+        <w:rPr>
+          <w:color w:val="1E293B"/>
+          <w:sz w:val="22"/>
+          <w:szCs w:val="22"/>
+        </w:rPr>
+        <w:t xml:space="preserve">Disponibilidad de datos: Solo 4 estaciones SENAMHI tienen suficientes registros (&gt;1000) para entrenamiento de largo plazo.</w:t>
+      </w:r>
+    </w:p>
+    <w:p>
+      <w:pPr>
+        <w:pStyle w:val="ListParagraph"/>
+        <w:numPr>
+          <w:ilvl w:val="0"/>
+          <w:numId w:val="2"/>
+        </w:numPr>
+        <w:spacing w:after="60"/>
+      </w:pPr>
+      <w:r>
+        <w:rPr>
+          <w:color w:val="1E293B"/>
+          <w:sz w:val="22"/>
+          <w:szCs w:val="22"/>
+        </w:rPr>
+        <w:t xml:space="preserve">Calidad de sensores: El sensor grupo_3 presenta datos defectuosos que impiden entrenar un modelo corto plazo confiable para PUNO.</w:t>
+      </w:r>
+    </w:p>
+    <w:p>
+      <w:pPr>
+        <w:pStyle w:val="ListParagraph"/>
+        <w:numPr>
+          <w:ilvl w:val="0"/>
+          <w:numId w:val="2"/>
+        </w:numPr>
+        <w:spacing w:after="60"/>
+      </w:pPr>
+      <w:r>
+        <w:rPr>
+          <w:color w:val="1E293B"/>
+          <w:sz w:val="22"/>
+          <w:szCs w:val="22"/>
+        </w:rPr>
+        <w:t xml:space="preserve">Horizonte de predicción corto plazo: Limitado a 5-15 minutos (frecuencia de muestreo de sensores).</w:t>
+      </w:r>
+    </w:p>
+    <w:p>
+      <w:pPr>
+        <w:pStyle w:val="ListParagraph"/>
+        <w:numPr>
+          <w:ilvl w:val="0"/>
+          <w:numId w:val="2"/>
+        </w:numPr>
+        <w:spacing w:after="60"/>
+      </w:pPr>
+      <w:r>
+        <w:rPr>
+          <w:color w:val="1E293B"/>
+          <w:sz w:val="22"/>
+          <w:szCs w:val="22"/>
+        </w:rPr>
+        <w:t xml:space="preserve">Sin re-entrenamiento automático: Los modelos deben re-entrenarse manualmente ejecutando los scripts train_largo_plazo.py y train_corto_plazo.py.</w:t>
+      </w:r>
+    </w:p>
+    <w:p>
+      <w:pPr>
+        <w:pStyle w:val="ListParagraph"/>
+        <w:numPr>
+          <w:ilvl w:val="0"/>
+          <w:numId w:val="2"/>
+        </w:numPr>
+        <w:spacing w:after="60"/>
+      </w:pPr>
+      <w:r>
+        <w:rPr>
+          <w:color w:val="1E293B"/>
+          <w:sz w:val="22"/>
+          <w:szCs w:val="22"/>
+        </w:rPr>
+        <w:t xml:space="preserve">Features limitados: Solo se usan features derivados de temperatura/presión; no se incorporan variables meteorológicas externas (viento, precipitación, radiación solar).</w:t>
+      </w:r>
+    </w:p>
+    <w:p>
+      <w:pPr>
+        <w:pStyle w:val="ListParagraph"/>
+        <w:numPr>
+          <w:ilvl w:val="0"/>
+          <w:numId w:val="2"/>
+        </w:numPr>
+        <w:spacing w:after="60"/>
+      </w:pPr>
+      <w:r>
+        <w:rPr>
+          <w:color w:val="1E293B"/>
+          <w:sz w:val="22"/>
+          <w:szCs w:val="22"/>
+        </w:rPr>
+        <w:t xml:space="preserve">Modelo único: Se utiliza XGBoost como único algoritmo; no se implementaron ensembles con Random Forest, LSTM u otros modelos.</w:t>
+      </w:r>
+    </w:p>
+    <w:p>
+      <w:pPr>
+        <w:pStyle w:val="Heading2"/>
+        <w:spacing w:before="300" w:after="160"/>
+      </w:pPr>
+      <w:r>
+        <w:rPr>
+          <w:b/>
+          <w:bCs/>
+          <w:color w:val="2E75B6"/>
+          <w:sz w:val="28"/>
+          <w:szCs w:val="28"/>
+        </w:rPr>
+        <w:t xml:space="preserve">11.9 Mejoras Propuestas para ML</w:t>
+      </w:r>
+    </w:p>
+    <w:p>
+      <w:pPr>
+        <w:pStyle w:val="ListParagraph"/>
+        <w:numPr>
+          <w:ilvl w:val="0"/>
+          <w:numId w:val="2"/>
+        </w:numPr>
+        <w:spacing w:after="60"/>
+      </w:pPr>
+      <w:r>
+        <w:rPr>
+          <w:color w:val="1E293B"/>
+          <w:sz w:val="22"/>
+          <w:szCs w:val="22"/>
+        </w:rPr>
+        <w:t xml:space="preserve">Re-entrenamiento automático programado (cron job en contenedor separado) o manual desde el dashboard.</w:t>
+      </w:r>
+    </w:p>
+    <w:p>
+      <w:pPr>
+        <w:pStyle w:val="ListParagraph"/>
+        <w:numPr>
+          <w:ilvl w:val="0"/>
+          <w:numId w:val="2"/>
+        </w:numPr>
+        <w:spacing w:after="60"/>
+      </w:pPr>
+      <w:r>
+        <w:rPr>
+          <w:color w:val="1E293B"/>
+          <w:sz w:val="22"/>
+          <w:szCs w:val="22"/>
+        </w:rPr>
+        <w:t xml:space="preserve">Incorporar más estaciones SENAMHI históricas para expandir cobertura geográfica.</w:t>
+      </w:r>
+    </w:p>
+    <w:p>
+      <w:pPr>
+        <w:pStyle w:val="ListParagraph"/>
+        <w:numPr>
+          <w:ilvl w:val="0"/>
+          <w:numId w:val="2"/>
+        </w:numPr>
+        <w:spacing w:after="60"/>
+      </w:pPr>
+      <w:r>
+        <w:rPr>
+          <w:color w:val="1E293B"/>
+          <w:sz w:val="22"/>
+          <w:szCs w:val="22"/>
+        </w:rPr>
+        <w:t xml:space="preserve">Implementar ensemble de modelos (XGBoost + Random Forest + LSTM) para predicción multi-variable.</w:t>
+      </w:r>
+    </w:p>
+    <w:p>
+      <w:pPr>
+        <w:pStyle w:val="ListParagraph"/>
+        <w:numPr>
+          <w:ilvl w:val="0"/>
+          <w:numId w:val="2"/>
+        </w:numPr>
+        <w:spacing w:after="60"/>
+      </w:pPr>
+      <w:r>
+        <w:rPr>
+          <w:color w:val="1E293B"/>
+          <w:sz w:val="22"/>
+          <w:szCs w:val="22"/>
+        </w:rPr>
+        <w:t xml:space="preserve">Agregar features externos: datos de viento, precipitación, radiación solar de fuentes abiertas.</w:t>
+      </w:r>
+    </w:p>
+    <w:p>
+      <w:pPr>
+        <w:pStyle w:val="ListParagraph"/>
+        <w:numPr>
+          <w:ilvl w:val="0"/>
+          <w:numId w:val="2"/>
+        </w:numPr>
+        <w:spacing w:after="60"/>
+      </w:pPr>
+      <w:r>
+        <w:rPr>
+          <w:color w:val="1E293B"/>
+          <w:sz w:val="22"/>
+          <w:szCs w:val="22"/>
+        </w:rPr>
+        <w:t xml:space="preserve">Migrar entrenamiento a Spark MLlib para escalar a cientos de estaciones.</w:t>
+      </w:r>
+    </w:p>
+    <w:p>
+      <w:pPr>
+        <w:pStyle w:val="ListParagraph"/>
+        <w:numPr>
+          <w:ilvl w:val="0"/>
+          <w:numId w:val="2"/>
+        </w:numPr>
+        <w:spacing w:after="60"/>
+      </w:pPr>
+      <w:r>
+        <w:rPr>
+          <w:color w:val="1E293B"/>
+          <w:sz w:val="22"/>
+          <w:szCs w:val="22"/>
+        </w:rPr>
+        <w:t xml:space="preserve">Implementar detección automática de sensores defectuosos basada en residuales de predicción.</w:t>
+      </w:r>
+    </w:p>
+    <w:p>
+      <w:pPr>
+        <w:pStyle w:val="ListParagraph"/>
+        <w:numPr>
+          <w:ilvl w:val="0"/>
+          <w:numId w:val="2"/>
+        </w:numPr>
+        <w:spacing w:after="60"/>
+      </w:pPr>
+      <w:r>
+        <w:rPr>
+          <w:color w:val="1E293B"/>
+          <w:sz w:val="22"/>
+          <w:szCs w:val="22"/>
+        </w:rPr>
+        <w:t xml:space="preserve">Agregar intervalo de confianza a las predicciones usando cuantiles del XGBoost.</w:t>
+      </w:r>
+    </w:p>
+    <w:p>
+      <w:pPr>
+        <w:pStyle w:val="ListParagraph"/>
+        <w:numPr>
+          <w:ilvl w:val="0"/>
+          <w:numId w:val="2"/>
+        </w:numPr>
+        <w:spacing w:after="60"/>
+      </w:pPr>
+      <w:r>
+        <w:rPr>
+          <w:color w:val="1E293B"/>
+          <w:sz w:val="22"/>
+          <w:szCs w:val="22"/>
+        </w:rPr>
+        <w:t xml:space="preserve">Pipeline CI/CD para validación y deploy de nuevos modelos automáticamente.</w:t>
+      </w:r>
+    </w:p>
+    <w:p>
+      <w:r>
+        <w:br w:type="page"/>
+      </w:r>
+    </w:p>
     <w:sectPr>
       <w:pgSz w:w="11906" w:h="16838" w:orient="portrait"/>
       <w:pgMar w:top="1440" w:right="1440" w:bottom="1440" w:left="1440" w:header="708" w:footer="708" w:gutter="0"/>

</xml_diff>